<commit_message>
Switch API docs to Swagger UI (OpenAPI 3) at /api-docs; update report with Swagger and team names
</commit_message>
<xml_diff>
--- a/docs/Smart_Campus_Project_Report.docx
+++ b/docs/Smart_Campus_Project_Report.docx
@@ -4,7 +4,7 @@
   <w:body>
     <w:p>
       <w:pPr>
-        <w:spacing w:before="1800"/>
+        <w:spacing w:before="1200"/>
         <w:jc w:val="center"/>
       </w:pPr>
       <w:r>
@@ -72,7 +72,7 @@
     </w:p>
     <w:p>
       <w:pPr>
-        <w:spacing w:after="1200"/>
+        <w:spacing w:after="800"/>
         <w:jc w:val="center"/>
       </w:pPr>
       <w:r>
@@ -101,7 +101,7 @@
     </w:p>
     <w:p>
       <w:pPr>
-        <w:spacing w:after="80"/>
+        <w:spacing w:after="60"/>
         <w:jc w:val="center"/>
       </w:pPr>
       <w:r>
@@ -109,7 +109,46 @@
           <w:sz w:val="22"/>
           <w:szCs w:val="22"/>
         </w:rPr>
-        <w:t xml:space="preserve">[Student Name] — [Roll Number]</w:t>
+        <w:t xml:space="preserve">Neel — [Roll Number]</w:t>
+      </w:r>
+    </w:p>
+    <w:p>
+      <w:pPr>
+        <w:spacing w:after="60"/>
+        <w:jc w:val="center"/>
+      </w:pPr>
+      <w:r>
+        <w:rPr>
+          <w:sz w:val="22"/>
+          <w:szCs w:val="22"/>
+        </w:rPr>
+        <w:t xml:space="preserve">Nimish — [Roll Number]</w:t>
+      </w:r>
+    </w:p>
+    <w:p>
+      <w:pPr>
+        <w:spacing w:after="60"/>
+        <w:jc w:val="center"/>
+      </w:pPr>
+      <w:r>
+        <w:rPr>
+          <w:sz w:val="22"/>
+          <w:szCs w:val="22"/>
+        </w:rPr>
+        <w:t xml:space="preserve">Swanandi — [Roll Number]</w:t>
+      </w:r>
+    </w:p>
+    <w:p>
+      <w:pPr>
+        <w:spacing w:after="60"/>
+        <w:jc w:val="center"/>
+      </w:pPr>
+      <w:r>
+        <w:rPr>
+          <w:sz w:val="22"/>
+          <w:szCs w:val="22"/>
+        </w:rPr>
+        <w:t xml:space="preserve">Akshay — [Roll Number]</w:t>
       </w:r>
     </w:p>
     <w:p>
@@ -122,7 +161,7 @@
           <w:sz w:val="22"/>
           <w:szCs w:val="22"/>
         </w:rPr>
-        <w:t xml:space="preserve">[Student Name] — [Roll Number]</w:t>
+        <w:t xml:space="preserve">Sneha — [Roll Number]</w:t>
       </w:r>
     </w:p>
     <w:p>
@@ -460,7 +499,17 @@
         <w:t xml:space="preserve">React</w:t>
       </w:r>
       <w:r>
-        <w:t xml:space="preserve"> single-page application with a tab-based dashboard for each role. Its three special features are an at-risk attendance dashboard, role-based security with department limits, and salted password hashing, and the API documents itself on a live docs page. The system was tested with 22 API and browser test cases, all of which passed.</w:t>
+        <w:t xml:space="preserve"> single-page application with a tab-based dashboard for each role. Its three special features are an at-risk attendance dashboard, role-based security with department limits, and salted password hashing, and the whole API is documented and testable in </w:t>
+      </w:r>
+      <w:r>
+        <w:rPr>
+          <w:b/>
+          <w:bCs/>
+        </w:rPr>
+        <w:t xml:space="preserve">Swagger UI</w:t>
+      </w:r>
+      <w:r>
+        <w:t xml:space="preserve"> (OpenAPI 3). The system was tested with 22 API and browser test cases, all of which passed.</w:t>
       </w:r>
     </w:p>
     <w:p>
@@ -4209,10 +4258,40 @@
           <w:b/>
           <w:bCs/>
         </w:rPr>
-        <w:t xml:space="preserve">Live API documentation:</w:t>
-      </w:r>
-      <w:r>
-        <w:t xml:space="preserve"> opening the API's address (http://localhost:8000) in a browser shows a full docs page listing all 28 endpoints, who can call each one, example requests and responses, and errors.</w:t>
+        <w:t xml:space="preserve">Swagger API docs and testing:</w:t>
+      </w:r>
+      <w:r>
+        <w:t xml:space="preserve"> opening http://localhost:8000/api-docs shows </w:t>
+      </w:r>
+      <w:r>
+        <w:rPr>
+          <w:b/>
+          <w:bCs/>
+        </w:rPr>
+        <w:t xml:space="preserve">Swagger UI</w:t>
+      </w:r>
+      <w:r>
+        <w:t xml:space="preserve"> with all 28 endpoints. You can log in, click </w:t>
+      </w:r>
+      <w:r>
+        <w:rPr>
+          <w:b/>
+          <w:bCs/>
+        </w:rPr>
+        <w:t xml:space="preserve">Authorize</w:t>
+      </w:r>
+      <w:r>
+        <w:t xml:space="preserve"> to paste the token, and test every endpoint with </w:t>
+      </w:r>
+      <w:r>
+        <w:rPr>
+          <w:b/>
+          <w:bCs/>
+        </w:rPr>
+        <w:t xml:space="preserve">Try it out</w:t>
+      </w:r>
+      <w:r>
+        <w:t xml:space="preserve"> — no Postman needed.</w:t>
       </w:r>
     </w:p>
     <w:p>
@@ -4287,9 +4366,9 @@
       <w:r>
         <w:drawing>
           <wp:inline distT="0" distB="0" distL="0" distR="0">
-            <wp:extent cx="5334000" cy="3381375"/>
+            <wp:extent cx="5334000" cy="3552825"/>
             <wp:effectExtent t="0" r="0" b="0" l="0"/>
-            <wp:docPr id="1" name="50-api-docs-home.png" descr="Live API docs page at http://localhost:8000" title="Live API docs page at http://localhost:8000"/>
+            <wp:docPr id="1" name="52-swagger-home.png" descr="Swagger UI at http://localhost:8000/api-docs" title="Swagger UI at http://localhost:8000/api-docs"/>
             <wp:cNvGraphicFramePr>
               <a:graphicFrameLocks xmlns:a="http://schemas.openxmlformats.org/drawingml/2006/main" noChangeAspect="1"/>
             </wp:cNvGraphicFramePr>
@@ -4312,7 +4391,7 @@
                   <pic:spPr bwMode="auto">
                     <a:xfrm>
                       <a:off x="0" y="0"/>
-                      <a:ext cx="5334000" cy="3381375"/>
+                      <a:ext cx="5334000" cy="3552825"/>
                     </a:xfrm>
                     <a:prstGeom prst="rect">
                       <a:avLst/>
@@ -4338,7 +4417,7 @@
           <w:sz w:val="18"/>
           <w:szCs w:val="18"/>
         </w:rPr>
-        <w:t xml:space="preserve">Figure 5: Live API docs page at http://localhost:8000</w:t>
+        <w:t xml:space="preserve">Figure 5: Swagger UI at http://localhost:8000/api-docs</w:t>
       </w:r>
     </w:p>
     <w:p>
@@ -5440,6 +5519,136 @@
                 <w:szCs w:val="19"/>
               </w:rPr>
               <w:t xml:space="preserve">server.js</w:t>
+            </w:r>
+          </w:p>
+        </w:tc>
+      </w:tr>
+      <w:tr>
+        <w:tc>
+          <w:tcPr>
+            <w:tcW w:type="dxa" w:w="1700"/>
+            <w:tcBorders>
+              <w:top w:val="single" w:color="A6A6A6" w:sz="4"/>
+              <w:left w:val="single" w:color="A6A6A6" w:sz="4"/>
+              <w:bottom w:val="single" w:color="A6A6A6" w:sz="4"/>
+              <w:right w:val="single" w:color="A6A6A6" w:sz="4"/>
+            </w:tcBorders>
+            <w:tcMar>
+              <w:top w:type="dxa" w:w="60"/>
+              <w:left w:type="dxa" w:w="100"/>
+              <w:bottom w:type="dxa" w:w="60"/>
+              <w:right w:type="dxa" w:w="100"/>
+            </w:tcMar>
+            <w:vAlign w:val="center"/>
+          </w:tcPr>
+          <w:p>
+            <w:pPr>
+              <w:spacing w:after="0"/>
+            </w:pPr>
+            <w:r>
+              <w:rPr>
+                <w:b w:val="false"/>
+                <w:bCs w:val="false"/>
+                <w:sz w:val="19"/>
+                <w:szCs w:val="19"/>
+              </w:rPr>
+              <w:t xml:space="preserve">Swagger UI (OpenAPI 3)</w:t>
+            </w:r>
+          </w:p>
+        </w:tc>
+        <w:tc>
+          <w:tcPr>
+            <w:tcW w:type="dxa" w:w="900"/>
+            <w:tcBorders>
+              <w:top w:val="single" w:color="A6A6A6" w:sz="4"/>
+              <w:left w:val="single" w:color="A6A6A6" w:sz="4"/>
+              <w:bottom w:val="single" w:color="A6A6A6" w:sz="4"/>
+              <w:right w:val="single" w:color="A6A6A6" w:sz="4"/>
+            </w:tcBorders>
+            <w:tcMar>
+              <w:top w:type="dxa" w:w="60"/>
+              <w:left w:type="dxa" w:w="100"/>
+              <w:bottom w:type="dxa" w:w="60"/>
+              <w:right w:type="dxa" w:w="100"/>
+            </w:tcMar>
+            <w:vAlign w:val="center"/>
+          </w:tcPr>
+          <w:p>
+            <w:pPr>
+              <w:spacing w:after="0"/>
+            </w:pPr>
+            <w:r>
+              <w:rPr>
+                <w:b w:val="false"/>
+                <w:bCs w:val="false"/>
+                <w:sz w:val="19"/>
+                <w:szCs w:val="19"/>
+              </w:rPr>
+              <w:t xml:space="preserve">5.0</w:t>
+            </w:r>
+          </w:p>
+        </w:tc>
+        <w:tc>
+          <w:tcPr>
+            <w:tcW w:type="dxa" w:w="3526"/>
+            <w:tcBorders>
+              <w:top w:val="single" w:color="A6A6A6" w:sz="4"/>
+              <w:left w:val="single" w:color="A6A6A6" w:sz="4"/>
+              <w:bottom w:val="single" w:color="A6A6A6" w:sz="4"/>
+              <w:right w:val="single" w:color="A6A6A6" w:sz="4"/>
+            </w:tcBorders>
+            <w:tcMar>
+              <w:top w:type="dxa" w:w="60"/>
+              <w:left w:type="dxa" w:w="100"/>
+              <w:bottom w:type="dxa" w:w="60"/>
+              <w:right w:type="dxa" w:w="100"/>
+            </w:tcMar>
+            <w:vAlign w:val="center"/>
+          </w:tcPr>
+          <w:p>
+            <w:pPr>
+              <w:spacing w:after="0"/>
+            </w:pPr>
+            <w:r>
+              <w:rPr>
+                <w:b w:val="false"/>
+                <w:bCs w:val="false"/>
+                <w:sz w:val="19"/>
+                <w:szCs w:val="19"/>
+              </w:rPr>
+              <w:t xml:space="preserve">A ready-made web page that shows every API endpoint and lets you test it with a button</w:t>
+            </w:r>
+          </w:p>
+        </w:tc>
+        <w:tc>
+          <w:tcPr>
+            <w:tcW w:type="dxa" w:w="2900"/>
+            <w:tcBorders>
+              <w:top w:val="single" w:color="A6A6A6" w:sz="4"/>
+              <w:left w:val="single" w:color="A6A6A6" w:sz="4"/>
+              <w:bottom w:val="single" w:color="A6A6A6" w:sz="4"/>
+              <w:right w:val="single" w:color="A6A6A6" w:sz="4"/>
+            </w:tcBorders>
+            <w:tcMar>
+              <w:top w:type="dxa" w:w="60"/>
+              <w:left w:type="dxa" w:w="100"/>
+              <w:bottom w:type="dxa" w:w="60"/>
+              <w:right w:type="dxa" w:w="100"/>
+            </w:tcMar>
+            <w:vAlign w:val="center"/>
+          </w:tcPr>
+          <w:p>
+            <w:pPr>
+              <w:spacing w:after="0"/>
+            </w:pPr>
+            <w:r>
+              <w:rPr>
+                <w:b w:val="false"/>
+                <w:bCs w:val="false"/>
+                <w:sz w:val="19"/>
+                <w:szCs w:val="19"/>
+              </w:rPr>
+              <w:t xml:space="preserve">swagger.json + /api-docs in server.js</w:t>
             </w:r>
           </w:p>
         </w:tc>
@@ -21839,6 +22048,19 @@
                 <w:sz w:val="17"/>
                 <w:szCs w:val="17"/>
               </w:rPr>
+              <w:t xml:space="preserve">├── swagger.json              OpenAPI 3 spec -&gt; Swagger UI at /api-docs</w:t>
+            </w:r>
+          </w:p>
+          <w:p>
+            <w:pPr>
+              <w:spacing w:after="0" w:line="240"/>
+            </w:pPr>
+            <w:r>
+              <w:rPr>
+                <w:rFonts w:ascii="Consolas" w:cs="Consolas" w:eastAsia="Consolas" w:hAnsi="Consolas"/>
+                <w:sz w:val="17"/>
+                <w:szCs w:val="17"/>
+              </w:rPr>
               <w:t xml:space="preserve">├── package.json              backend libraries + npm scripts</w:t>
             </w:r>
           </w:p>
@@ -21930,20 +22152,7 @@
                 <w:sz w:val="17"/>
                 <w:szCs w:val="17"/>
               </w:rPr>
-              <w:t xml:space="preserve">│   ├── password.js           hashPassword() / checkPassword()</w:t>
-            </w:r>
-          </w:p>
-          <w:p>
-            <w:pPr>
-              <w:spacing w:after="0" w:line="240"/>
-            </w:pPr>
-            <w:r>
-              <w:rPr>
-                <w:rFonts w:ascii="Consolas" w:cs="Consolas" w:eastAsia="Consolas" w:hAnsi="Consolas"/>
-                <w:sz w:val="17"/>
-                <w:szCs w:val="17"/>
-              </w:rPr>
-              <w:t xml:space="preserve">│   └── apiDocs.js            API docs page served at GET /</w:t>
+              <w:t xml:space="preserve">│   └── password.js           hashPassword() / checkPassword()</w:t>
             </w:r>
           </w:p>
           <w:p>
@@ -22249,7 +22458,7 @@
                 <w:sz w:val="16"/>
                 <w:szCs w:val="16"/>
               </w:rPr>
-              <w:t xml:space="preserve">server.js  (lines 1–66)</w:t>
+              <w:t xml:space="preserve">server.js  (lines 1–72)</w:t>
             </w:r>
           </w:p>
           <w:p>
@@ -22483,20 +22692,33 @@
                 <w:sz w:val="17"/>
                 <w:szCs w:val="17"/>
               </w:rPr>
-              <w:t xml:space="preserve">// api docs page data</w:t>
-            </w:r>
-          </w:p>
-          <w:p>
-            <w:pPr>
-              <w:spacing w:after="0" w:line="240"/>
-            </w:pPr>
-            <w:r>
-              <w:rPr>
-                <w:rFonts w:ascii="Consolas" w:cs="Consolas" w:eastAsia="Consolas" w:hAnsi="Consolas"/>
-                <w:sz w:val="17"/>
-                <w:szCs w:val="17"/>
-              </w:rPr>
-              <w:t xml:space="preserve">const { apiDocs, apiDocsPage } = require("./utils/apiDocs");</w:t>
+              <w:t xml:space="preserve">// swagger ui (api docs + testing page) n our openapi spec file</w:t>
+            </w:r>
+          </w:p>
+          <w:p>
+            <w:pPr>
+              <w:spacing w:after="0" w:line="240"/>
+            </w:pPr>
+            <w:r>
+              <w:rPr>
+                <w:rFonts w:ascii="Consolas" w:cs="Consolas" w:eastAsia="Consolas" w:hAnsi="Consolas"/>
+                <w:sz w:val="17"/>
+                <w:szCs w:val="17"/>
+              </w:rPr>
+              <w:t xml:space="preserve">const swaggerUi = require("swagger-ui-express");</w:t>
+            </w:r>
+          </w:p>
+          <w:p>
+            <w:pPr>
+              <w:spacing w:after="0" w:line="240"/>
+            </w:pPr>
+            <w:r>
+              <w:rPr>
+                <w:rFonts w:ascii="Consolas" w:cs="Consolas" w:eastAsia="Consolas" w:hAnsi="Consolas"/>
+                <w:sz w:val="17"/>
+                <w:szCs w:val="17"/>
+              </w:rPr>
+              <w:t xml:space="preserve">const swaggerDocument = require("./swagger.json");</w:t>
             </w:r>
           </w:p>
           <w:p>
@@ -22613,20 +22835,137 @@
                 <w:sz w:val="17"/>
                 <w:szCs w:val="17"/>
               </w:rPr>
-              <w:t xml:space="preserve">// api docs are public -&gt; open http://localhost:8000 in the browser</w:t>
-            </w:r>
-          </w:p>
-          <w:p>
-            <w:pPr>
-              <w:spacing w:after="0" w:line="240"/>
-            </w:pPr>
-            <w:r>
-              <w:rPr>
-                <w:rFonts w:ascii="Consolas" w:cs="Consolas" w:eastAsia="Consolas" w:hAnsi="Consolas"/>
-                <w:sz w:val="17"/>
-                <w:szCs w:val="17"/>
-              </w:rPr>
-              <w:t xml:space="preserve">// (has to be above authMiddleware or u'd need a token just to read the docs)</w:t>
+              <w:t xml:space="preserve">// swagger docs + testing page -&gt; open http://localhost:8000/api-docs</w:t>
+            </w:r>
+          </w:p>
+          <w:p>
+            <w:pPr>
+              <w:spacing w:after="0" w:line="240"/>
+            </w:pPr>
+            <w:r>
+              <w:rPr>
+                <w:rFonts w:ascii="Consolas" w:cs="Consolas" w:eastAsia="Consolas" w:hAnsi="Consolas"/>
+                <w:sz w:val="17"/>
+                <w:szCs w:val="17"/>
+              </w:rPr>
+              <w:t xml:space="preserve">// (has to be above authMiddleware or u'd need a token just to open the docs)</w:t>
+            </w:r>
+          </w:p>
+          <w:p>
+            <w:pPr>
+              <w:spacing w:after="0" w:line="240"/>
+            </w:pPr>
+            <w:r>
+              <w:rPr>
+                <w:rFonts w:ascii="Consolas" w:cs="Consolas" w:eastAsia="Consolas" w:hAnsi="Consolas"/>
+                <w:sz w:val="17"/>
+                <w:szCs w:val="17"/>
+              </w:rPr>
+              <w:t xml:space="preserve">// persistAuthorization = remembers ur token even after refreshing the page</w:t>
+            </w:r>
+          </w:p>
+          <w:p>
+            <w:pPr>
+              <w:spacing w:after="0" w:line="240"/>
+            </w:pPr>
+            <w:r>
+              <w:rPr>
+                <w:rFonts w:ascii="Consolas" w:cs="Consolas" w:eastAsia="Consolas" w:hAnsi="Consolas"/>
+                <w:sz w:val="17"/>
+                <w:szCs w:val="17"/>
+              </w:rPr>
+              <w:t xml:space="preserve">app.use("/api-docs", swaggerUi.serve, swaggerUi.setup(swaggerDocument, {</w:t>
+            </w:r>
+          </w:p>
+          <w:p>
+            <w:pPr>
+              <w:spacing w:after="0" w:line="240"/>
+            </w:pPr>
+            <w:r>
+              <w:rPr>
+                <w:rFonts w:ascii="Consolas" w:cs="Consolas" w:eastAsia="Consolas" w:hAnsi="Consolas"/>
+                <w:sz w:val="17"/>
+                <w:szCs w:val="17"/>
+              </w:rPr>
+              <w:t xml:space="preserve">    swaggerOptions: { persistAuthorization: true },</w:t>
+            </w:r>
+          </w:p>
+          <w:p>
+            <w:pPr>
+              <w:spacing w:after="0" w:line="240"/>
+            </w:pPr>
+            <w:r>
+              <w:rPr>
+                <w:rFonts w:ascii="Consolas" w:cs="Consolas" w:eastAsia="Consolas" w:hAnsi="Consolas"/>
+                <w:sz w:val="17"/>
+                <w:szCs w:val="17"/>
+              </w:rPr>
+              <w:t xml:space="preserve">}));</w:t>
+            </w:r>
+          </w:p>
+          <w:p>
+            <w:pPr>
+              <w:spacing w:after="0" w:line="240"/>
+            </w:pPr>
+            <w:r>
+              <w:rPr>
+                <w:rFonts w:ascii="Consolas" w:cs="Consolas" w:eastAsia="Consolas" w:hAnsi="Consolas"/>
+                <w:sz w:val="17"/>
+                <w:szCs w:val="17"/>
+              </w:rPr>
+              <w:t xml:space="preserve">// raw openapi spec as json (can import it into postman)</w:t>
+            </w:r>
+          </w:p>
+          <w:p>
+            <w:pPr>
+              <w:spacing w:after="0" w:line="240"/>
+            </w:pPr>
+            <w:r>
+              <w:rPr>
+                <w:rFonts w:ascii="Consolas" w:cs="Consolas" w:eastAsia="Consolas" w:hAnsi="Consolas"/>
+                <w:sz w:val="17"/>
+                <w:szCs w:val="17"/>
+              </w:rPr>
+              <w:t xml:space="preserve">app.get("/api-docs.json", (req,res)=&gt;{</w:t>
+            </w:r>
+          </w:p>
+          <w:p>
+            <w:pPr>
+              <w:spacing w:after="0" w:line="240"/>
+            </w:pPr>
+            <w:r>
+              <w:rPr>
+                <w:rFonts w:ascii="Consolas" w:cs="Consolas" w:eastAsia="Consolas" w:hAnsi="Consolas"/>
+                <w:sz w:val="17"/>
+                <w:szCs w:val="17"/>
+              </w:rPr>
+              <w:t xml:space="preserve">    res.json(swaggerDocument);</w:t>
+            </w:r>
+          </w:p>
+          <w:p>
+            <w:pPr>
+              <w:spacing w:after="0" w:line="240"/>
+            </w:pPr>
+            <w:r>
+              <w:rPr>
+                <w:rFonts w:ascii="Consolas" w:cs="Consolas" w:eastAsia="Consolas" w:hAnsi="Consolas"/>
+                <w:sz w:val="17"/>
+                <w:szCs w:val="17"/>
+              </w:rPr>
+              <w:t xml:space="preserve">})</w:t>
+            </w:r>
+          </w:p>
+          <w:p>
+            <w:pPr>
+              <w:spacing w:after="0" w:line="240"/>
+            </w:pPr>
+            <w:r>
+              <w:rPr>
+                <w:rFonts w:ascii="Consolas" w:cs="Consolas" w:eastAsia="Consolas" w:hAnsi="Consolas"/>
+                <w:sz w:val="17"/>
+                <w:szCs w:val="17"/>
+              </w:rPr>
+              <w:t xml:space="preserve">// home page just sends u to the swagger docs</w:t>
             </w:r>
           </w:p>
           <w:p>
@@ -22652,59 +22991,7 @@
                 <w:sz w:val="17"/>
                 <w:szCs w:val="17"/>
               </w:rPr>
-              <w:t xml:space="preserve">    res.send(apiDocsPage());</w:t>
-            </w:r>
-          </w:p>
-          <w:p>
-            <w:pPr>
-              <w:spacing w:after="0" w:line="240"/>
-            </w:pPr>
-            <w:r>
-              <w:rPr>
-                <w:rFonts w:ascii="Consolas" w:cs="Consolas" w:eastAsia="Consolas" w:hAnsi="Consolas"/>
-                <w:sz w:val="17"/>
-                <w:szCs w:val="17"/>
-              </w:rPr>
-              <w:t xml:space="preserve">})</w:t>
-            </w:r>
-          </w:p>
-          <w:p>
-            <w:pPr>
-              <w:spacing w:after="0" w:line="240"/>
-            </w:pPr>
-            <w:r>
-              <w:rPr>
-                <w:rFonts w:ascii="Consolas" w:cs="Consolas" w:eastAsia="Consolas" w:hAnsi="Consolas"/>
-                <w:sz w:val="17"/>
-                <w:szCs w:val="17"/>
-              </w:rPr>
-              <w:t xml:space="preserve">// same docs as json (for postman / other tools)</w:t>
-            </w:r>
-          </w:p>
-          <w:p>
-            <w:pPr>
-              <w:spacing w:after="0" w:line="240"/>
-            </w:pPr>
-            <w:r>
-              <w:rPr>
-                <w:rFonts w:ascii="Consolas" w:cs="Consolas" w:eastAsia="Consolas" w:hAnsi="Consolas"/>
-                <w:sz w:val="17"/>
-                <w:szCs w:val="17"/>
-              </w:rPr>
-              <w:t xml:space="preserve">app.get("/docs.json", (req,res)=&gt;{</w:t>
-            </w:r>
-          </w:p>
-          <w:p>
-            <w:pPr>
-              <w:spacing w:after="0" w:line="240"/>
-            </w:pPr>
-            <w:r>
-              <w:rPr>
-                <w:rFonts w:ascii="Consolas" w:cs="Consolas" w:eastAsia="Consolas" w:hAnsi="Consolas"/>
-                <w:sz w:val="17"/>
-                <w:szCs w:val="17"/>
-              </w:rPr>
-              <w:t xml:space="preserve">    res.json(apiDocs);</w:t>
+              <w:t xml:space="preserve">    res.redirect("/api-docs");</w:t>
             </w:r>
           </w:p>
           <w:p>
@@ -23141,7 +23428,19 @@
         <w:spacing w:after="60"/>
       </w:pPr>
       <w:r>
-        <w:t xml:space="preserve">Lines 2–19 load Express, CORS, the database function, all 10 route files, the auth middleware and the API docs.</w:t>
+        <w:t xml:space="preserve">Lines 2–20 load Express, CORS, the database function, all 10 route files, the auth middleware, Swagger UI and our </w:t>
+      </w:r>
+      <w:r>
+        <w:rPr>
+          <w:rFonts w:ascii="Consolas" w:cs="Consolas" w:eastAsia="Consolas" w:hAnsi="Consolas"/>
+          <w:color w:val="833C0B"/>
+          <w:sz w:val="20"/>
+          <w:szCs w:val="20"/>
+        </w:rPr>
+        <w:t xml:space="preserve">swagger.json</w:t>
+      </w:r>
+      <w:r>
+        <w:t xml:space="preserve"> spec.</w:t>
       </w:r>
     </w:p>
     <w:p>
@@ -23154,7 +23453,7 @@
         <w:spacing w:after="60"/>
       </w:pPr>
       <w:r>
-        <w:t xml:space="preserve">Line 22 creates the app and line 23 connects to MongoDB.</w:t>
+        <w:t xml:space="preserve">Line 23 creates the app and line 24 connects to MongoDB.</w:t>
       </w:r>
     </w:p>
     <w:p>
@@ -23167,7 +23466,7 @@
         <w:spacing w:after="60"/>
       </w:pPr>
       <w:r>
-        <w:t xml:space="preserve">Line 25 </w:t>
+        <w:t xml:space="preserve">Line 26 </w:t>
       </w:r>
       <w:r>
         <w:rPr>
@@ -23192,7 +23491,7 @@
         <w:spacing w:after="60"/>
       </w:pPr>
       <w:r>
-        <w:t xml:space="preserve">Line 26 </w:t>
+        <w:t xml:space="preserve">Line 27 </w:t>
       </w:r>
       <w:r>
         <w:rPr>
@@ -23229,17 +23528,41 @@
         <w:spacing w:after="60"/>
       </w:pPr>
       <w:r>
-        <w:t xml:space="preserve">Lines 30–36 serve the </w:t>
+        <w:t xml:space="preserve">Lines 32–34 serve </w:t>
       </w:r>
       <w:r>
         <w:rPr>
           <w:b/>
           <w:bCs/>
         </w:rPr>
-        <w:t xml:space="preserve">API docs page</w:t>
+        <w:t xml:space="preserve">Swagger UI</w:t>
       </w:r>
       <w:r>
         <w:t xml:space="preserve"> at </w:t>
+      </w:r>
+      <w:r>
+        <w:rPr>
+          <w:rFonts w:ascii="Consolas" w:cs="Consolas" w:eastAsia="Consolas" w:hAnsi="Consolas"/>
+          <w:color w:val="833C0B"/>
+          <w:sz w:val="20"/>
+          <w:szCs w:val="20"/>
+        </w:rPr>
+        <w:t xml:space="preserve">/api-docs</w:t>
+      </w:r>
+      <w:r>
+        <w:t xml:space="preserve">; line 37 serves the raw spec at </w:t>
+      </w:r>
+      <w:r>
+        <w:rPr>
+          <w:rFonts w:ascii="Consolas" w:cs="Consolas" w:eastAsia="Consolas" w:hAnsi="Consolas"/>
+          <w:color w:val="833C0B"/>
+          <w:sz w:val="20"/>
+          <w:szCs w:val="20"/>
+        </w:rPr>
+        <w:t xml:space="preserve">/api-docs.json</w:t>
+      </w:r>
+      <w:r>
+        <w:t xml:space="preserve">; lines 40–42 send the home page </w:t>
       </w:r>
       <w:r>
         <w:rPr>
@@ -23251,19 +23574,7 @@
         <w:t xml:space="preserve">/</w:t>
       </w:r>
       <w:r>
-        <w:t xml:space="preserve"> and the same docs as JSON at </w:t>
-      </w:r>
-      <w:r>
-        <w:rPr>
-          <w:rFonts w:ascii="Consolas" w:cs="Consolas" w:eastAsia="Consolas" w:hAnsi="Consolas"/>
-          <w:color w:val="833C0B"/>
-          <w:sz w:val="20"/>
-          <w:szCs w:val="20"/>
-        </w:rPr>
-        <w:t xml:space="preserve">/docs.json</w:t>
-      </w:r>
-      <w:r>
-        <w:t xml:space="preserve">. They come before the auth middleware, so anyone can read them.</w:t>
+        <w:t xml:space="preserve"> to the docs. All of these come before the auth middleware, so anyone can open them.</w:t>
       </w:r>
     </w:p>
     <w:p>
@@ -23276,7 +23587,7 @@
         <w:spacing w:after="60"/>
       </w:pPr>
       <w:r>
-        <w:t xml:space="preserve">Line 39 mounts </w:t>
+        <w:t xml:space="preserve">Line 45 mounts </w:t>
       </w:r>
       <w:r>
         <w:rPr>
@@ -23311,7 +23622,7 @@
         <w:spacing w:after="60"/>
       </w:pPr>
       <w:r>
-        <w:t xml:space="preserve">Line 43 </w:t>
+        <w:t xml:space="preserve">Line 49 </w:t>
       </w:r>
       <w:r>
         <w:rPr>
@@ -23336,7 +23647,7 @@
         <w:spacing w:after="60"/>
       </w:pPr>
       <w:r>
-        <w:t xml:space="preserve">Lines 45–53 mount the protected route files.</w:t>
+        <w:t xml:space="preserve">Lines 51–59 mount the protected route files.</w:t>
       </w:r>
     </w:p>
     <w:p>
@@ -23349,7 +23660,7 @@
         <w:spacing w:after="60"/>
       </w:pPr>
       <w:r>
-        <w:t xml:space="preserve">Lines 57–61 are the catch-all: if no route matched, answer </w:t>
+        <w:t xml:space="preserve">Lines 63–67 are the catch-all: if no route matched, answer </w:t>
       </w:r>
       <w:r>
         <w:rPr>
@@ -23372,7 +23683,7 @@
         <w:spacing w:after="60"/>
       </w:pPr>
       <w:r>
-        <w:t xml:space="preserve">Line 64 starts listening on port 8000.</w:t>
+        <w:t xml:space="preserve">Line 70 starts listening on port 8000.</w:t>
       </w:r>
     </w:p>
     <w:p>
@@ -35657,7 +35968,7 @@
         <w:t xml:space="preserve">/auth/login</w:t>
       </w:r>
       <w:r>
-        <w:t xml:space="preserve"> (and the docs page) need the header </w:t>
+        <w:t xml:space="preserve"> (and the Swagger docs) need the header </w:t>
       </w:r>
       <w:r>
         <w:rPr>
@@ -35677,7 +35988,7 @@
         <w:pStyle w:val="Heading2"/>
       </w:pPr>
       <w:r>
-        <w:t xml:space="preserve">10.1 Live API Docs Page</w:t>
+        <w:t xml:space="preserve">10.1 Swagger: API Documentation and Testing</w:t>
       </w:r>
     </w:p>
     <w:p>
@@ -35686,17 +35997,353 @@
         <w:jc w:val="both"/>
       </w:pPr>
       <w:r>
-        <w:t xml:space="preserve">Opening the base URL in a browser shows our </w:t>
+        <w:t xml:space="preserve">We document and test the API with </w:t>
       </w:r>
       <w:r>
         <w:rPr>
           <w:b/>
           <w:bCs/>
         </w:rPr>
-        <w:t xml:space="preserve">API documentation page</w:t>
-      </w:r>
-      <w:r>
-        <w:t xml:space="preserve">. It lists all 28 endpoints grouped by module, with a colour for each method (GET, POST, PUT, DELETE), whether a token is needed, which roles can call it, query parameters, an example request body, an example response and the possible errors. The left menu jumps to any endpoint.</w:t>
+        <w:t xml:space="preserve">Swagger UI</w:t>
+      </w:r>
+      <w:r>
+        <w:t xml:space="preserve">. The whole API is described in one file, </w:t>
+      </w:r>
+      <w:r>
+        <w:rPr>
+          <w:rFonts w:ascii="Consolas" w:cs="Consolas" w:eastAsia="Consolas" w:hAnsi="Consolas"/>
+          <w:color w:val="833C0B"/>
+          <w:sz w:val="20"/>
+          <w:szCs w:val="20"/>
+        </w:rPr>
+        <w:t xml:space="preserve">swagger.json</w:t>
+      </w:r>
+      <w:r>
+        <w:t xml:space="preserve">, written in the </w:t>
+      </w:r>
+      <w:r>
+        <w:rPr>
+          <w:b/>
+          <w:bCs/>
+        </w:rPr>
+        <w:t xml:space="preserve">OpenAPI 3</w:t>
+      </w:r>
+      <w:r>
+        <w:t xml:space="preserve"> standard: every path, its parameters, the request body (with required fields and allowed values), example responses, error codes and which endpoints need a token. The </w:t>
+      </w:r>
+      <w:r>
+        <w:rPr>
+          <w:rFonts w:ascii="Consolas" w:cs="Consolas" w:eastAsia="Consolas" w:hAnsi="Consolas"/>
+          <w:color w:val="833C0B"/>
+          <w:sz w:val="20"/>
+          <w:szCs w:val="20"/>
+        </w:rPr>
+        <w:t xml:space="preserve">swagger-ui-express</w:t>
+      </w:r>
+      <w:r>
+        <w:t xml:space="preserve"> package turns that file into an interactive web page.</w:t>
+      </w:r>
+    </w:p>
+    <w:tbl>
+      <w:tblPr>
+        <w:tblW w:type="dxa" w:w="9026"/>
+        <w:tblBorders>
+          <w:top w:val="single" w:color="auto" w:sz="4"/>
+          <w:left w:val="single" w:color="auto" w:sz="4"/>
+          <w:bottom w:val="single" w:color="auto" w:sz="4"/>
+          <w:right w:val="single" w:color="auto" w:sz="4"/>
+          <w:insideH w:val="single" w:color="auto" w:sz="4"/>
+          <w:insideV w:val="single" w:color="auto" w:sz="4"/>
+        </w:tblBorders>
+      </w:tblPr>
+      <w:tblGrid>
+        <w:gridCol w:w="3800"/>
+        <w:gridCol w:w="5226"/>
+      </w:tblGrid>
+      <w:tr>
+        <w:trPr>
+          <w:tblHeader/>
+        </w:trPr>
+        <w:tc>
+          <w:tcPr>
+            <w:tcW w:type="dxa" w:w="3800"/>
+            <w:tcBorders>
+              <w:top w:val="single" w:color="A6A6A6" w:sz="4"/>
+              <w:left w:val="single" w:color="A6A6A6" w:sz="4"/>
+              <w:bottom w:val="single" w:color="A6A6A6" w:sz="4"/>
+              <w:right w:val="single" w:color="A6A6A6" w:sz="4"/>
+            </w:tcBorders>
+            <w:shd w:fill="D9E2F3" w:color="auto" w:val="clear"/>
+            <w:tcMar>
+              <w:top w:type="dxa" w:w="60"/>
+              <w:left w:type="dxa" w:w="100"/>
+              <w:bottom w:type="dxa" w:w="60"/>
+              <w:right w:type="dxa" w:w="100"/>
+            </w:tcMar>
+            <w:vAlign w:val="center"/>
+          </w:tcPr>
+          <w:p>
+            <w:pPr>
+              <w:spacing w:after="0"/>
+            </w:pPr>
+            <w:r>
+              <w:rPr>
+                <w:b/>
+                <w:bCs/>
+                <w:sz w:val="19"/>
+                <w:szCs w:val="19"/>
+              </w:rPr>
+              <w:t xml:space="preserve">URL</w:t>
+            </w:r>
+          </w:p>
+        </w:tc>
+        <w:tc>
+          <w:tcPr>
+            <w:tcW w:type="dxa" w:w="5226"/>
+            <w:tcBorders>
+              <w:top w:val="single" w:color="A6A6A6" w:sz="4"/>
+              <w:left w:val="single" w:color="A6A6A6" w:sz="4"/>
+              <w:bottom w:val="single" w:color="A6A6A6" w:sz="4"/>
+              <w:right w:val="single" w:color="A6A6A6" w:sz="4"/>
+            </w:tcBorders>
+            <w:shd w:fill="D9E2F3" w:color="auto" w:val="clear"/>
+            <w:tcMar>
+              <w:top w:type="dxa" w:w="60"/>
+              <w:left w:type="dxa" w:w="100"/>
+              <w:bottom w:type="dxa" w:w="60"/>
+              <w:right w:type="dxa" w:w="100"/>
+            </w:tcMar>
+            <w:vAlign w:val="center"/>
+          </w:tcPr>
+          <w:p>
+            <w:pPr>
+              <w:spacing w:after="0"/>
+            </w:pPr>
+            <w:r>
+              <w:rPr>
+                <w:b/>
+                <w:bCs/>
+                <w:sz w:val="19"/>
+                <w:szCs w:val="19"/>
+              </w:rPr>
+              <w:t xml:space="preserve">What you get</w:t>
+            </w:r>
+          </w:p>
+        </w:tc>
+      </w:tr>
+      <w:tr>
+        <w:tc>
+          <w:tcPr>
+            <w:tcW w:type="dxa" w:w="3800"/>
+            <w:tcBorders>
+              <w:top w:val="single" w:color="A6A6A6" w:sz="4"/>
+              <w:left w:val="single" w:color="A6A6A6" w:sz="4"/>
+              <w:bottom w:val="single" w:color="A6A6A6" w:sz="4"/>
+              <w:right w:val="single" w:color="A6A6A6" w:sz="4"/>
+            </w:tcBorders>
+            <w:tcMar>
+              <w:top w:type="dxa" w:w="60"/>
+              <w:left w:type="dxa" w:w="100"/>
+              <w:bottom w:type="dxa" w:w="60"/>
+              <w:right w:type="dxa" w:w="100"/>
+            </w:tcMar>
+            <w:vAlign w:val="center"/>
+          </w:tcPr>
+          <w:p>
+            <w:pPr>
+              <w:spacing w:after="0"/>
+            </w:pPr>
+            <w:r>
+              <w:rPr>
+                <w:b w:val="false"/>
+                <w:bCs w:val="false"/>
+                <w:sz w:val="19"/>
+                <w:szCs w:val="19"/>
+              </w:rPr>
+              <w:t xml:space="preserve">http://localhost:8000/api-docs</w:t>
+            </w:r>
+          </w:p>
+        </w:tc>
+        <w:tc>
+          <w:tcPr>
+            <w:tcW w:type="dxa" w:w="5226"/>
+            <w:tcBorders>
+              <w:top w:val="single" w:color="A6A6A6" w:sz="4"/>
+              <w:left w:val="single" w:color="A6A6A6" w:sz="4"/>
+              <w:bottom w:val="single" w:color="A6A6A6" w:sz="4"/>
+              <w:right w:val="single" w:color="A6A6A6" w:sz="4"/>
+            </w:tcBorders>
+            <w:tcMar>
+              <w:top w:type="dxa" w:w="60"/>
+              <w:left w:type="dxa" w:w="100"/>
+              <w:bottom w:type="dxa" w:w="60"/>
+              <w:right w:type="dxa" w:w="100"/>
+            </w:tcMar>
+            <w:vAlign w:val="center"/>
+          </w:tcPr>
+          <w:p>
+            <w:pPr>
+              <w:spacing w:after="0"/>
+            </w:pPr>
+            <w:r>
+              <w:rPr>
+                <w:b w:val="false"/>
+                <w:bCs w:val="false"/>
+                <w:sz w:val="19"/>
+                <w:szCs w:val="19"/>
+              </w:rPr>
+              <w:t xml:space="preserve">Swagger UI — read the docs and test every endpoint</w:t>
+            </w:r>
+          </w:p>
+        </w:tc>
+      </w:tr>
+      <w:tr>
+        <w:tc>
+          <w:tcPr>
+            <w:tcW w:type="dxa" w:w="3800"/>
+            <w:tcBorders>
+              <w:top w:val="single" w:color="A6A6A6" w:sz="4"/>
+              <w:left w:val="single" w:color="A6A6A6" w:sz="4"/>
+              <w:bottom w:val="single" w:color="A6A6A6" w:sz="4"/>
+              <w:right w:val="single" w:color="A6A6A6" w:sz="4"/>
+            </w:tcBorders>
+            <w:tcMar>
+              <w:top w:type="dxa" w:w="60"/>
+              <w:left w:type="dxa" w:w="100"/>
+              <w:bottom w:type="dxa" w:w="60"/>
+              <w:right w:type="dxa" w:w="100"/>
+            </w:tcMar>
+            <w:vAlign w:val="center"/>
+          </w:tcPr>
+          <w:p>
+            <w:pPr>
+              <w:spacing w:after="0"/>
+            </w:pPr>
+            <w:r>
+              <w:rPr>
+                <w:b w:val="false"/>
+                <w:bCs w:val="false"/>
+                <w:sz w:val="19"/>
+                <w:szCs w:val="19"/>
+              </w:rPr>
+              <w:t xml:space="preserve">http://localhost:8000/api-docs.json</w:t>
+            </w:r>
+          </w:p>
+        </w:tc>
+        <w:tc>
+          <w:tcPr>
+            <w:tcW w:type="dxa" w:w="5226"/>
+            <w:tcBorders>
+              <w:top w:val="single" w:color="A6A6A6" w:sz="4"/>
+              <w:left w:val="single" w:color="A6A6A6" w:sz="4"/>
+              <w:bottom w:val="single" w:color="A6A6A6" w:sz="4"/>
+              <w:right w:val="single" w:color="A6A6A6" w:sz="4"/>
+            </w:tcBorders>
+            <w:tcMar>
+              <w:top w:type="dxa" w:w="60"/>
+              <w:left w:type="dxa" w:w="100"/>
+              <w:bottom w:type="dxa" w:w="60"/>
+              <w:right w:type="dxa" w:w="100"/>
+            </w:tcMar>
+            <w:vAlign w:val="center"/>
+          </w:tcPr>
+          <w:p>
+            <w:pPr>
+              <w:spacing w:after="0"/>
+            </w:pPr>
+            <w:r>
+              <w:rPr>
+                <w:b w:val="false"/>
+                <w:bCs w:val="false"/>
+                <w:sz w:val="19"/>
+                <w:szCs w:val="19"/>
+              </w:rPr>
+              <w:t xml:space="preserve">The raw OpenAPI spec (can be imported into Postman)</w:t>
+            </w:r>
+          </w:p>
+        </w:tc>
+      </w:tr>
+      <w:tr>
+        <w:tc>
+          <w:tcPr>
+            <w:tcW w:type="dxa" w:w="3800"/>
+            <w:tcBorders>
+              <w:top w:val="single" w:color="A6A6A6" w:sz="4"/>
+              <w:left w:val="single" w:color="A6A6A6" w:sz="4"/>
+              <w:bottom w:val="single" w:color="A6A6A6" w:sz="4"/>
+              <w:right w:val="single" w:color="A6A6A6" w:sz="4"/>
+            </w:tcBorders>
+            <w:tcMar>
+              <w:top w:type="dxa" w:w="60"/>
+              <w:left w:type="dxa" w:w="100"/>
+              <w:bottom w:type="dxa" w:w="60"/>
+              <w:right w:type="dxa" w:w="100"/>
+            </w:tcMar>
+            <w:vAlign w:val="center"/>
+          </w:tcPr>
+          <w:p>
+            <w:pPr>
+              <w:spacing w:after="0"/>
+            </w:pPr>
+            <w:r>
+              <w:rPr>
+                <w:b w:val="false"/>
+                <w:bCs w:val="false"/>
+                <w:sz w:val="19"/>
+                <w:szCs w:val="19"/>
+              </w:rPr>
+              <w:t xml:space="preserve">http://localhost:8000/</w:t>
+            </w:r>
+          </w:p>
+        </w:tc>
+        <w:tc>
+          <w:tcPr>
+            <w:tcW w:type="dxa" w:w="5226"/>
+            <w:tcBorders>
+              <w:top w:val="single" w:color="A6A6A6" w:sz="4"/>
+              <w:left w:val="single" w:color="A6A6A6" w:sz="4"/>
+              <w:bottom w:val="single" w:color="A6A6A6" w:sz="4"/>
+              <w:right w:val="single" w:color="A6A6A6" w:sz="4"/>
+            </w:tcBorders>
+            <w:tcMar>
+              <w:top w:type="dxa" w:w="60"/>
+              <w:left w:type="dxa" w:w="100"/>
+              <w:bottom w:type="dxa" w:w="60"/>
+              <w:right w:type="dxa" w:w="100"/>
+            </w:tcMar>
+            <w:vAlign w:val="center"/>
+          </w:tcPr>
+          <w:p>
+            <w:pPr>
+              <w:spacing w:after="0"/>
+            </w:pPr>
+            <w:r>
+              <w:rPr>
+                <w:b w:val="false"/>
+                <w:bCs w:val="false"/>
+                <w:sz w:val="19"/>
+                <w:szCs w:val="19"/>
+              </w:rPr>
+              <w:t xml:space="preserve">Redirects to /api-docs</w:t>
+            </w:r>
+          </w:p>
+        </w:tc>
+      </w:tr>
+    </w:tbl>
+    <w:p>
+      <w:pPr>
+        <w:spacing w:after="200" w:before="60"/>
+        <w:jc w:val="center"/>
+      </w:pPr>
+      <w:r>
+        <w:rPr>
+          <w:i/>
+          <w:iCs/>
+          <w:color w:val="404040"/>
+          <w:sz w:val="18"/>
+          <w:szCs w:val="18"/>
+        </w:rPr>
+        <w:t xml:space="preserve">Table 24: Swagger URLs</w:t>
       </w:r>
     </w:p>
     <w:p>
@@ -35708,9 +36355,9 @@
       <w:r>
         <w:drawing>
           <wp:inline distT="0" distB="0" distL="0" distR="0">
-            <wp:extent cx="5715000" cy="3619500"/>
+            <wp:extent cx="5715000" cy="3810000"/>
             <wp:effectExtent t="0" r="0" b="0" l="0"/>
-            <wp:docPr id="1" name="50-api-docs-home.png" descr="API docs page: base URL, authentication and status codes" title="API docs page: base URL, authentication and status codes"/>
+            <wp:docPr id="1" name="52-swagger-home.png" descr="Swagger UI: all endpoints grouped by module, with the Authorize button" title="Swagger UI: all endpoints grouped by module, with the Authorize button"/>
             <wp:cNvGraphicFramePr>
               <a:graphicFrameLocks xmlns:a="http://schemas.openxmlformats.org/drawingml/2006/main" noChangeAspect="1"/>
             </wp:cNvGraphicFramePr>
@@ -35733,7 +36380,7 @@
                   <pic:spPr bwMode="auto">
                     <a:xfrm>
                       <a:off x="0" y="0"/>
-                      <a:ext cx="5715000" cy="3619500"/>
+                      <a:ext cx="5715000" cy="3810000"/>
                     </a:xfrm>
                     <a:prstGeom prst="rect">
                       <a:avLst/>
@@ -35759,7 +36406,166 @@
           <w:sz w:val="18"/>
           <w:szCs w:val="18"/>
         </w:rPr>
-        <w:t xml:space="preserve">Figure 9: API docs page: base URL, authentication and status codes</w:t>
+        <w:t xml:space="preserve">Figure 9: Swagger UI: all endpoints grouped by module, with the Authorize button</w:t>
+      </w:r>
+    </w:p>
+    <w:p>
+      <w:pPr>
+        <w:spacing w:after="120" w:line="276"/>
+        <w:jc w:val="both"/>
+      </w:pPr>
+      <w:r>
+        <w:rPr>
+          <w:b/>
+          <w:bCs/>
+        </w:rPr>
+        <w:t xml:space="preserve">How to test an endpoint in Swagger:</w:t>
+      </w:r>
+    </w:p>
+    <w:p>
+      <w:pPr>
+        <w:pStyle w:val="ListParagraph"/>
+        <w:numPr>
+          <w:ilvl w:val="0"/>
+          <w:numId w:val="7"/>
+        </w:numPr>
+        <w:spacing w:after="60"/>
+      </w:pPr>
+      <w:r>
+        <w:t xml:space="preserve">Open </w:t>
+      </w:r>
+      <w:r>
+        <w:rPr>
+          <w:b/>
+          <w:bCs/>
+        </w:rPr>
+        <w:t xml:space="preserve">Auth → POST /auth/login</w:t>
+      </w:r>
+      <w:r>
+        <w:t xml:space="preserve">, click </w:t>
+      </w:r>
+      <w:r>
+        <w:rPr>
+          <w:b/>
+          <w:bCs/>
+        </w:rPr>
+        <w:t xml:space="preserve">Try it out</w:t>
+      </w:r>
+      <w:r>
+        <w:t xml:space="preserve">, then </w:t>
+      </w:r>
+      <w:r>
+        <w:rPr>
+          <w:b/>
+          <w:bCs/>
+        </w:rPr>
+        <w:t xml:space="preserve">Execute</w:t>
+      </w:r>
+      <w:r>
+        <w:t xml:space="preserve">. The demo email and password are already filled in.</w:t>
+      </w:r>
+    </w:p>
+    <w:p>
+      <w:pPr>
+        <w:pStyle w:val="ListParagraph"/>
+        <w:numPr>
+          <w:ilvl w:val="0"/>
+          <w:numId w:val="7"/>
+        </w:numPr>
+        <w:spacing w:after="60"/>
+      </w:pPr>
+      <w:r>
+        <w:t xml:space="preserve">Copy the </w:t>
+      </w:r>
+      <w:r>
+        <w:rPr>
+          <w:rFonts w:ascii="Consolas" w:cs="Consolas" w:eastAsia="Consolas" w:hAnsi="Consolas"/>
+          <w:color w:val="833C0B"/>
+          <w:sz w:val="20"/>
+          <w:szCs w:val="20"/>
+        </w:rPr>
+        <w:t xml:space="preserve">token</w:t>
+      </w:r>
+      <w:r>
+        <w:t xml:space="preserve"> from the response.</w:t>
+      </w:r>
+    </w:p>
+    <w:p>
+      <w:pPr>
+        <w:pStyle w:val="ListParagraph"/>
+        <w:numPr>
+          <w:ilvl w:val="0"/>
+          <w:numId w:val="7"/>
+        </w:numPr>
+        <w:spacing w:after="60"/>
+      </w:pPr>
+      <w:r>
+        <w:t xml:space="preserve">Click </w:t>
+      </w:r>
+      <w:r>
+        <w:rPr>
+          <w:b/>
+          <w:bCs/>
+        </w:rPr>
+        <w:t xml:space="preserve">Authorize</w:t>
+      </w:r>
+      <w:r>
+        <w:t xml:space="preserve"> (top right), paste the token and click </w:t>
+      </w:r>
+      <w:r>
+        <w:rPr>
+          <w:b/>
+          <w:bCs/>
+        </w:rPr>
+        <w:t xml:space="preserve">Authorize</w:t>
+      </w:r>
+      <w:r>
+        <w:t xml:space="preserve">. Swagger remembers it even after a page refresh.</w:t>
+      </w:r>
+    </w:p>
+    <w:p>
+      <w:pPr>
+        <w:pStyle w:val="ListParagraph"/>
+        <w:numPr>
+          <w:ilvl w:val="0"/>
+          <w:numId w:val="7"/>
+        </w:numPr>
+        <w:spacing w:after="60"/>
+      </w:pPr>
+      <w:r>
+        <w:t xml:space="preserve">Open any endpoint, click </w:t>
+      </w:r>
+      <w:r>
+        <w:rPr>
+          <w:b/>
+          <w:bCs/>
+        </w:rPr>
+        <w:t xml:space="preserve">Try it out</w:t>
+      </w:r>
+      <w:r>
+        <w:t xml:space="preserve">, change the values if you want, and click </w:t>
+      </w:r>
+      <w:r>
+        <w:rPr>
+          <w:b/>
+          <w:bCs/>
+        </w:rPr>
+        <w:t xml:space="preserve">Execute</w:t>
+      </w:r>
+      <w:r>
+        <w:t xml:space="preserve">. Swagger shows the real response, the status code and the matching </w:t>
+      </w:r>
+      <w:r>
+        <w:rPr>
+          <w:rFonts w:ascii="Consolas" w:cs="Consolas" w:eastAsia="Consolas" w:hAnsi="Consolas"/>
+          <w:color w:val="833C0B"/>
+          <w:sz w:val="20"/>
+          <w:szCs w:val="20"/>
+        </w:rPr>
+        <w:t xml:space="preserve">curl</w:t>
+      </w:r>
+      <w:r>
+        <w:t xml:space="preserve"> command.</w:t>
       </w:r>
     </w:p>
     <w:p>
@@ -35771,9 +36577,9 @@
       <w:r>
         <w:drawing>
           <wp:inline distT="0" distB="0" distL="0" distR="0">
-            <wp:extent cx="4572000" cy="3314700"/>
+            <wp:extent cx="2209800" cy="4953000"/>
             <wp:effectExtent t="0" r="0" b="0" l="0"/>
-            <wp:docPr id="1" name="51-api-docs-endpoint.png" descr="One endpoint card: POST /attendance/mark" title="One endpoint card: POST /attendance/mark"/>
+            <wp:docPr id="1" name="53-swagger-login.png" descr="Step 1: logging in with Try it out — the token comes back in the response" title="Step 1: logging in with Try it out — the token comes back in the response"/>
             <wp:cNvGraphicFramePr>
               <a:graphicFrameLocks xmlns:a="http://schemas.openxmlformats.org/drawingml/2006/main" noChangeAspect="1"/>
             </wp:cNvGraphicFramePr>
@@ -35796,7 +36602,7 @@
                   <pic:spPr bwMode="auto">
                     <a:xfrm>
                       <a:off x="0" y="0"/>
-                      <a:ext cx="4572000" cy="3314700"/>
+                      <a:ext cx="2209800" cy="4953000"/>
                     </a:xfrm>
                     <a:prstGeom prst="rect">
                       <a:avLst/>
@@ -35822,7 +36628,133 @@
           <w:sz w:val="18"/>
           <w:szCs w:val="18"/>
         </w:rPr>
-        <w:t xml:space="preserve">Figure 10: One endpoint card: POST /attendance/mark</w:t>
+        <w:t xml:space="preserve">Figure 10: Step 1: logging in with Try it out — the token comes back in the response</w:t>
+      </w:r>
+    </w:p>
+    <w:p>
+      <w:pPr>
+        <w:keepNext/>
+        <w:spacing w:after="60" w:before="120"/>
+        <w:jc w:val="center"/>
+      </w:pPr>
+      <w:r>
+        <w:drawing>
+          <wp:inline distT="0" distB="0" distL="0" distR="0">
+            <wp:extent cx="5715000" cy="3810000"/>
+            <wp:effectExtent t="0" r="0" b="0" l="0"/>
+            <wp:docPr id="1" name="54-swagger-authorize.png" descr="Step 3: pasting the token into Authorize" title="Step 3: pasting the token into Authorize"/>
+            <wp:cNvGraphicFramePr>
+              <a:graphicFrameLocks xmlns:a="http://schemas.openxmlformats.org/drawingml/2006/main" noChangeAspect="1"/>
+            </wp:cNvGraphicFramePr>
+            <a:graphic xmlns:a="http://schemas.openxmlformats.org/drawingml/2006/main">
+              <a:graphicData uri="http://schemas.openxmlformats.org/drawingml/2006/picture">
+                <pic:pic xmlns:pic="http://schemas.openxmlformats.org/drawingml/2006/picture">
+                  <pic:nvPicPr>
+                    <pic:cNvPr id="0" name="" descr=""/>
+                    <pic:cNvPicPr>
+                      <a:picLocks noChangeAspect="1" noChangeArrowheads="1"/>
+                    </pic:cNvPicPr>
+                  </pic:nvPicPr>
+                  <pic:blipFill>
+                    <a:blip r:embed="rId22" cstate="none"/>
+                    <a:srcRect/>
+                    <a:stretch>
+                      <a:fillRect/>
+                    </a:stretch>
+                  </pic:blipFill>
+                  <pic:spPr bwMode="auto">
+                    <a:xfrm>
+                      <a:off x="0" y="0"/>
+                      <a:ext cx="5715000" cy="3810000"/>
+                    </a:xfrm>
+                    <a:prstGeom prst="rect">
+                      <a:avLst/>
+                    </a:prstGeom>
+                  </pic:spPr>
+                </pic:pic>
+              </a:graphicData>
+            </a:graphic>
+          </wp:inline>
+        </w:drawing>
+      </w:r>
+    </w:p>
+    <w:p>
+      <w:pPr>
+        <w:spacing w:after="220"/>
+        <w:jc w:val="center"/>
+      </w:pPr>
+      <w:r>
+        <w:rPr>
+          <w:i/>
+          <w:iCs/>
+          <w:color w:val="404040"/>
+          <w:sz w:val="18"/>
+          <w:szCs w:val="18"/>
+        </w:rPr>
+        <w:t xml:space="preserve">Figure 11: Step 3: pasting the token into Authorize</w:t>
+      </w:r>
+    </w:p>
+    <w:p>
+      <w:pPr>
+        <w:keepNext/>
+        <w:spacing w:after="60" w:before="120"/>
+        <w:jc w:val="center"/>
+      </w:pPr>
+      <w:r>
+        <w:drawing>
+          <wp:inline distT="0" distB="0" distL="0" distR="0">
+            <wp:extent cx="4381500" cy="4610100"/>
+            <wp:effectExtent t="0" r="0" b="0" l="0"/>
+            <wp:docPr id="1" name="55-swagger-try-courses.png" descr="Step 4: GET /courses with the token — real data from MongoDB (200)" title="Step 4: GET /courses with the token — real data from MongoDB (200)"/>
+            <wp:cNvGraphicFramePr>
+              <a:graphicFrameLocks xmlns:a="http://schemas.openxmlformats.org/drawingml/2006/main" noChangeAspect="1"/>
+            </wp:cNvGraphicFramePr>
+            <a:graphic xmlns:a="http://schemas.openxmlformats.org/drawingml/2006/main">
+              <a:graphicData uri="http://schemas.openxmlformats.org/drawingml/2006/picture">
+                <pic:pic xmlns:pic="http://schemas.openxmlformats.org/drawingml/2006/picture">
+                  <pic:nvPicPr>
+                    <pic:cNvPr id="0" name="" descr=""/>
+                    <pic:cNvPicPr>
+                      <a:picLocks noChangeAspect="1" noChangeArrowheads="1"/>
+                    </pic:cNvPicPr>
+                  </pic:nvPicPr>
+                  <pic:blipFill>
+                    <a:blip r:embed="rId23" cstate="none"/>
+                    <a:srcRect/>
+                    <a:stretch>
+                      <a:fillRect/>
+                    </a:stretch>
+                  </pic:blipFill>
+                  <pic:spPr bwMode="auto">
+                    <a:xfrm>
+                      <a:off x="0" y="0"/>
+                      <a:ext cx="4381500" cy="4610100"/>
+                    </a:xfrm>
+                    <a:prstGeom prst="rect">
+                      <a:avLst/>
+                    </a:prstGeom>
+                  </pic:spPr>
+                </pic:pic>
+              </a:graphicData>
+            </a:graphic>
+          </wp:inline>
+        </w:drawing>
+      </w:r>
+    </w:p>
+    <w:p>
+      <w:pPr>
+        <w:spacing w:after="220"/>
+        <w:jc w:val="center"/>
+      </w:pPr>
+      <w:r>
+        <w:rPr>
+          <w:i/>
+          <w:iCs/>
+          <w:color w:val="404040"/>
+          <w:sz w:val="18"/>
+          <w:szCs w:val="18"/>
+        </w:rPr>
+        <w:t xml:space="preserve">Figure 12: Step 4: GET /courses with the token — real data from MongoDB (200)</w:t>
       </w:r>
     </w:p>
     <w:p>
@@ -35835,7 +36767,17 @@
         <w:spacing w:after="60"/>
       </w:pPr>
       <w:r>
-        <w:t xml:space="preserve">The docs are built from one list in </w:t>
+        <w:t xml:space="preserve">Endpoints with a </w:t>
+      </w:r>
+      <w:r>
+        <w:rPr>
+          <w:b/>
+          <w:bCs/>
+        </w:rPr>
+        <w:t xml:space="preserve">lock icon</w:t>
+      </w:r>
+      <w:r>
+        <w:t xml:space="preserve"> need a token. </w:t>
       </w:r>
       <w:r>
         <w:rPr>
@@ -35844,10 +36786,10 @@
           <w:sz w:val="20"/>
           <w:szCs w:val="20"/>
         </w:rPr>
-        <w:t xml:space="preserve">utils/apiDocs.js</w:t>
-      </w:r>
-      <w:r>
-        <w:t xml:space="preserve">. To document a new route, we just add one object to that list and the page updates itself.</w:t>
+        <w:t xml:space="preserve">/auth/login</w:t>
+      </w:r>
+      <w:r>
+        <w:t xml:space="preserve"> has no lock.</w:t>
       </w:r>
     </w:p>
     <w:p>
@@ -35860,19 +36802,17 @@
         <w:spacing w:after="60"/>
       </w:pPr>
       <w:r>
-        <w:t xml:space="preserve">The same data is available as JSON at </w:t>
+        <w:t xml:space="preserve">Trying an endpoint with the wrong role shows the real error, e.g. faculty calling POST /users gets </w:t>
       </w:r>
       <w:r>
         <w:rPr>
-          <w:rFonts w:ascii="Consolas" w:cs="Consolas" w:eastAsia="Consolas" w:hAnsi="Consolas"/>
-          <w:color w:val="833C0B"/>
-          <w:sz w:val="20"/>
-          <w:szCs w:val="20"/>
+          <w:b/>
+          <w:bCs/>
         </w:rPr>
-        <w:t xml:space="preserve">http://localhost:8000/docs.json</w:t>
-      </w:r>
-      <w:r>
-        <w:t xml:space="preserve"> for tools like Postman.</w:t>
+        <w:t xml:space="preserve">403 Access denied for role: faculty</w:t>
+      </w:r>
+      <w:r>
+        <w:t xml:space="preserve">.</w:t>
       </w:r>
     </w:p>
     <w:p>
@@ -35885,7 +36825,7 @@
         <w:spacing w:after="60"/>
       </w:pPr>
       <w:r>
-        <w:t xml:space="preserve">Any URL that doesn't exist now returns </w:t>
+        <w:t xml:space="preserve">Any URL that doesn't exist returns </w:t>
       </w:r>
       <w:r>
         <w:rPr>
@@ -35909,6 +36849,83 @@
       <w:r>
         <w:t xml:space="preserve">.</w:t>
       </w:r>
+    </w:p>
+    <w:p>
+      <w:pPr>
+        <w:spacing w:after="60"/>
+      </w:pPr>
+    </w:p>
+    <w:tbl>
+      <w:tblPr>
+        <w:tblW w:type="dxa" w:w="9026"/>
+        <w:tblBorders>
+          <w:top w:val="single" w:color="auto" w:sz="4"/>
+          <w:left w:val="single" w:color="auto" w:sz="4"/>
+          <w:bottom w:val="single" w:color="auto" w:sz="4"/>
+          <w:right w:val="single" w:color="auto" w:sz="4"/>
+          <w:insideH w:val="single" w:color="auto" w:sz="4"/>
+          <w:insideV w:val="single" w:color="auto" w:sz="4"/>
+        </w:tblBorders>
+      </w:tblPr>
+      <w:tblGrid>
+        <w:gridCol w:w="9026"/>
+      </w:tblGrid>
+      <w:tr>
+        <w:tc>
+          <w:tcPr>
+            <w:tcW w:type="dxa" w:w="9026"/>
+            <w:tcBorders>
+              <w:top w:val="single" w:color="EAF1FB" w:sz="4"/>
+              <w:left w:val="single" w:color="2F5496" w:sz="24"/>
+              <w:bottom w:val="single" w:color="EAF1FB" w:sz="4"/>
+              <w:right w:val="single" w:color="EAF1FB" w:sz="4"/>
+            </w:tcBorders>
+            <w:shd w:fill="EAF1FB" w:color="auto" w:val="clear"/>
+            <w:tcMar>
+              <w:top w:type="dxa" w:w="100"/>
+              <w:left w:type="dxa" w:w="180"/>
+              <w:bottom w:type="dxa" w:w="100"/>
+              <w:right w:type="dxa" w:w="140"/>
+            </w:tcMar>
+          </w:tcPr>
+          <w:p>
+            <w:pPr>
+              <w:spacing w:after="60"/>
+            </w:pPr>
+            <w:r>
+              <w:rPr>
+                <w:b/>
+                <w:bCs/>
+                <w:color w:val="2F5496"/>
+              </w:rPr>
+              <w:t xml:space="preserve">In simple words</w:t>
+            </w:r>
+          </w:p>
+          <w:p>
+            <w:pPr>
+              <w:spacing w:after="60"/>
+            </w:pPr>
+            <w:r>
+              <w:t xml:space="preserve">Swagger is like a </w:t>
+            </w:r>
+            <w:r>
+              <w:rPr>
+                <w:b/>
+                <w:bCs/>
+              </w:rPr>
+              <w:t xml:space="preserve">TV remote with every button labelled</w:t>
+            </w:r>
+            <w:r>
+              <w:t xml:space="preserve">. Instead of writing code to talk to the server, you press a button (Execute) and the answer shows up right away. The Authorize button is where you put your wristband (token) once, so every button after that works as you.</w:t>
+            </w:r>
+          </w:p>
+        </w:tc>
+      </w:tr>
+    </w:tbl>
+    <w:p>
+      <w:pPr>
+        <w:spacing w:after="60"/>
+      </w:pPr>
     </w:p>
     <w:p>
       <w:pPr>
@@ -39077,7 +40094,7 @@
           <w:sz w:val="18"/>
           <w:szCs w:val="18"/>
         </w:rPr>
-        <w:t xml:space="preserve">Table 24: Complete list of API endpoints</w:t>
+        <w:t xml:space="preserve">Table 25: Complete list of API endpoints</w:t>
       </w:r>
     </w:p>
     <w:p>
@@ -43095,7 +44112,7 @@
           <w:sz w:val="18"/>
           <w:szCs w:val="18"/>
         </w:rPr>
-        <w:t xml:space="preserve">Table 25: React components</w:t>
+        <w:t xml:space="preserve">Table 26: React components</w:t>
       </w:r>
     </w:p>
     <w:p>
@@ -43122,189 +44139,6 @@
       </w:pPr>
       <w:r>
         <w:t xml:space="preserve">12.1 Logging In</w:t>
-      </w:r>
-    </w:p>
-    <w:p>
-      <w:pPr>
-        <w:pStyle w:val="ListParagraph"/>
-        <w:numPr>
-          <w:ilvl w:val="0"/>
-          <w:numId w:val="7"/>
-        </w:numPr>
-        <w:spacing w:after="60"/>
-      </w:pPr>
-      <w:r>
-        <w:t xml:space="preserve">Open http://localhost:5173.</w:t>
-      </w:r>
-    </w:p>
-    <w:p>
-      <w:pPr>
-        <w:pStyle w:val="ListParagraph"/>
-        <w:numPr>
-          <w:ilvl w:val="0"/>
-          <w:numId w:val="7"/>
-        </w:numPr>
-        <w:spacing w:after="60"/>
-      </w:pPr>
-      <w:r>
-        <w:t xml:space="preserve">Type email and password (or click a demo button).</w:t>
-      </w:r>
-    </w:p>
-    <w:p>
-      <w:pPr>
-        <w:pStyle w:val="ListParagraph"/>
-        <w:numPr>
-          <w:ilvl w:val="0"/>
-          <w:numId w:val="7"/>
-        </w:numPr>
-        <w:spacing w:after="60"/>
-      </w:pPr>
-      <w:r>
-        <w:t xml:space="preserve">Click </w:t>
-      </w:r>
-      <w:r>
-        <w:rPr>
-          <w:b/>
-          <w:bCs/>
-        </w:rPr>
-        <w:t xml:space="preserve">Login</w:t>
-      </w:r>
-      <w:r>
-        <w:t xml:space="preserve">. The token is saved and the dashboard for your role opens.</w:t>
-      </w:r>
-    </w:p>
-    <w:p>
-      <w:pPr>
-        <w:keepNext/>
-        <w:spacing w:after="60" w:before="120"/>
-        <w:jc w:val="center"/>
-      </w:pPr>
-      <w:r>
-        <w:drawing>
-          <wp:inline distT="0" distB="0" distL="0" distR="0">
-            <wp:extent cx="4000500" cy="1638300"/>
-            <wp:effectExtent t="0" r="0" b="0" l="0"/>
-            <wp:docPr id="1" name="01-login.png" descr="Login page with demo account buttons" title="Login page with demo account buttons"/>
-            <wp:cNvGraphicFramePr>
-              <a:graphicFrameLocks xmlns:a="http://schemas.openxmlformats.org/drawingml/2006/main" noChangeAspect="1"/>
-            </wp:cNvGraphicFramePr>
-            <a:graphic xmlns:a="http://schemas.openxmlformats.org/drawingml/2006/main">
-              <a:graphicData uri="http://schemas.openxmlformats.org/drawingml/2006/picture">
-                <pic:pic xmlns:pic="http://schemas.openxmlformats.org/drawingml/2006/picture">
-                  <pic:nvPicPr>
-                    <pic:cNvPr id="0" name="" descr=""/>
-                    <pic:cNvPicPr>
-                      <a:picLocks noChangeAspect="1" noChangeArrowheads="1"/>
-                    </pic:cNvPicPr>
-                  </pic:nvPicPr>
-                  <pic:blipFill>
-                    <a:blip r:embed="rId22" cstate="none"/>
-                    <a:srcRect/>
-                    <a:stretch>
-                      <a:fillRect/>
-                    </a:stretch>
-                  </pic:blipFill>
-                  <pic:spPr bwMode="auto">
-                    <a:xfrm>
-                      <a:off x="0" y="0"/>
-                      <a:ext cx="4000500" cy="1638300"/>
-                    </a:xfrm>
-                    <a:prstGeom prst="rect">
-                      <a:avLst/>
-                    </a:prstGeom>
-                  </pic:spPr>
-                </pic:pic>
-              </a:graphicData>
-            </a:graphic>
-          </wp:inline>
-        </w:drawing>
-      </w:r>
-    </w:p>
-    <w:p>
-      <w:pPr>
-        <w:spacing w:after="220"/>
-        <w:jc w:val="center"/>
-      </w:pPr>
-      <w:r>
-        <w:rPr>
-          <w:i/>
-          <w:iCs/>
-          <w:color w:val="404040"/>
-          <w:sz w:val="18"/>
-          <w:szCs w:val="18"/>
-        </w:rPr>
-        <w:t xml:space="preserve">Figure 11: Login page with demo account buttons</w:t>
-      </w:r>
-    </w:p>
-    <w:p>
-      <w:pPr>
-        <w:keepNext/>
-        <w:spacing w:after="60" w:before="120"/>
-        <w:jc w:val="center"/>
-      </w:pPr>
-      <w:r>
-        <w:drawing>
-          <wp:inline distT="0" distB="0" distL="0" distR="0">
-            <wp:extent cx="4000500" cy="1762125"/>
-            <wp:effectExtent t="0" r="0" b="0" l="0"/>
-            <wp:docPr id="1" name="02-login-error.png" descr="Wrong password — the server's 401 message is shown" title="Wrong password — the server's 401 message is shown"/>
-            <wp:cNvGraphicFramePr>
-              <a:graphicFrameLocks xmlns:a="http://schemas.openxmlformats.org/drawingml/2006/main" noChangeAspect="1"/>
-            </wp:cNvGraphicFramePr>
-            <a:graphic xmlns:a="http://schemas.openxmlformats.org/drawingml/2006/main">
-              <a:graphicData uri="http://schemas.openxmlformats.org/drawingml/2006/picture">
-                <pic:pic xmlns:pic="http://schemas.openxmlformats.org/drawingml/2006/picture">
-                  <pic:nvPicPr>
-                    <pic:cNvPr id="0" name="" descr=""/>
-                    <pic:cNvPicPr>
-                      <a:picLocks noChangeAspect="1" noChangeArrowheads="1"/>
-                    </pic:cNvPicPr>
-                  </pic:nvPicPr>
-                  <pic:blipFill>
-                    <a:blip r:embed="rId23" cstate="none"/>
-                    <a:srcRect/>
-                    <a:stretch>
-                      <a:fillRect/>
-                    </a:stretch>
-                  </pic:blipFill>
-                  <pic:spPr bwMode="auto">
-                    <a:xfrm>
-                      <a:off x="0" y="0"/>
-                      <a:ext cx="4000500" cy="1762125"/>
-                    </a:xfrm>
-                    <a:prstGeom prst="rect">
-                      <a:avLst/>
-                    </a:prstGeom>
-                  </pic:spPr>
-                </pic:pic>
-              </a:graphicData>
-            </a:graphic>
-          </wp:inline>
-        </w:drawing>
-      </w:r>
-    </w:p>
-    <w:p>
-      <w:pPr>
-        <w:spacing w:after="220"/>
-        <w:jc w:val="center"/>
-      </w:pPr>
-      <w:r>
-        <w:rPr>
-          <w:i/>
-          <w:iCs/>
-          <w:color w:val="404040"/>
-          <w:sz w:val="18"/>
-          <w:szCs w:val="18"/>
-        </w:rPr>
-        <w:t xml:space="preserve">Figure 12: Wrong password — the server's 401 message is shown</w:t>
-      </w:r>
-    </w:p>
-    <w:p>
-      <w:pPr>
-        <w:pStyle w:val="Heading2"/>
-      </w:pPr>
-      <w:r>
-        <w:t xml:space="preserve">12.2 Admin Flow</w:t>
       </w:r>
     </w:p>
     <w:p>
@@ -43317,17 +44151,7 @@
         <w:spacing w:after="60"/>
       </w:pPr>
       <w:r>
-        <w:t xml:space="preserve">Admin logs in and lands on </w:t>
-      </w:r>
-      <w:r>
-        <w:rPr>
-          <w:b/>
-          <w:bCs/>
-        </w:rPr>
-        <w:t xml:space="preserve">Students</w:t>
-      </w:r>
-      <w:r>
-        <w:t xml:space="preserve"> — 5 per page with Prev/Next.</w:t>
+        <w:t xml:space="preserve">Open http://localhost:5173.</w:t>
       </w:r>
     </w:p>
     <w:p>
@@ -43340,7 +44164,7 @@
         <w:spacing w:after="60"/>
       </w:pPr>
       <w:r>
-        <w:t xml:space="preserve">Types in the search box to find a student by name, email or roll number.</w:t>
+        <w:t xml:space="preserve">Type email and password (or click a demo button).</w:t>
       </w:r>
     </w:p>
     <w:p>
@@ -43353,53 +44177,17 @@
         <w:spacing w:after="60"/>
       </w:pPr>
       <w:r>
-        <w:t xml:space="preserve">Opens </w:t>
+        <w:t xml:space="preserve">Click </w:t>
       </w:r>
       <w:r>
         <w:rPr>
           <w:b/>
           <w:bCs/>
         </w:rPr>
-        <w:t xml:space="preserve">Add User</w:t>
-      </w:r>
-      <w:r>
-        <w:t xml:space="preserve">, picks a role (the form changes for student vs faculty) and saves.</w:t>
-      </w:r>
-    </w:p>
-    <w:p>
-      <w:pPr>
-        <w:pStyle w:val="ListParagraph"/>
-        <w:numPr>
-          <w:ilvl w:val="0"/>
-          <w:numId w:val="8"/>
-        </w:numPr>
-        <w:spacing w:after="60"/>
-      </w:pPr>
-      <w:r>
-        <w:t xml:space="preserve">Opens </w:t>
-      </w:r>
-      <w:r>
-        <w:rPr>
-          <w:b/>
-          <w:bCs/>
-        </w:rPr>
-        <w:t xml:space="preserve">Courses</w:t>
-      </w:r>
-      <w:r>
-        <w:t xml:space="preserve"> to add a course and assign a teacher.</w:t>
-      </w:r>
-    </w:p>
-    <w:p>
-      <w:pPr>
-        <w:pStyle w:val="ListParagraph"/>
-        <w:numPr>
-          <w:ilvl w:val="0"/>
-          <w:numId w:val="8"/>
-        </w:numPr>
-        <w:spacing w:after="60"/>
-      </w:pPr>
-      <w:r>
-        <w:t xml:space="preserve">Can also post notices/events and handle complaints and leaves for the whole college.</w:t>
+        <w:t xml:space="preserve">Login</w:t>
+      </w:r>
+      <w:r>
+        <w:t xml:space="preserve">. The token is saved and the dashboard for your role opens.</w:t>
       </w:r>
     </w:p>
     <w:p>
@@ -43411,9 +44199,9 @@
       <w:r>
         <w:drawing>
           <wp:inline distT="0" distB="0" distL="0" distR="0">
-            <wp:extent cx="5715000" cy="2667000"/>
+            <wp:extent cx="4000500" cy="1638300"/>
             <wp:effectExtent t="0" r="0" b="0" l="0"/>
-            <wp:docPr id="1" name="40-admin-students.png" descr="Admin — student list, page 1 of 2" title="Admin — student list, page 1 of 2"/>
+            <wp:docPr id="1" name="01-login.png" descr="Login page with demo account buttons" title="Login page with demo account buttons"/>
             <wp:cNvGraphicFramePr>
               <a:graphicFrameLocks xmlns:a="http://schemas.openxmlformats.org/drawingml/2006/main" noChangeAspect="1"/>
             </wp:cNvGraphicFramePr>
@@ -43436,6 +44224,235 @@
                   <pic:spPr bwMode="auto">
                     <a:xfrm>
                       <a:off x="0" y="0"/>
+                      <a:ext cx="4000500" cy="1638300"/>
+                    </a:xfrm>
+                    <a:prstGeom prst="rect">
+                      <a:avLst/>
+                    </a:prstGeom>
+                  </pic:spPr>
+                </pic:pic>
+              </a:graphicData>
+            </a:graphic>
+          </wp:inline>
+        </w:drawing>
+      </w:r>
+    </w:p>
+    <w:p>
+      <w:pPr>
+        <w:spacing w:after="220"/>
+        <w:jc w:val="center"/>
+      </w:pPr>
+      <w:r>
+        <w:rPr>
+          <w:i/>
+          <w:iCs/>
+          <w:color w:val="404040"/>
+          <w:sz w:val="18"/>
+          <w:szCs w:val="18"/>
+        </w:rPr>
+        <w:t xml:space="preserve">Figure 13: Login page with demo account buttons</w:t>
+      </w:r>
+    </w:p>
+    <w:p>
+      <w:pPr>
+        <w:keepNext/>
+        <w:spacing w:after="60" w:before="120"/>
+        <w:jc w:val="center"/>
+      </w:pPr>
+      <w:r>
+        <w:drawing>
+          <wp:inline distT="0" distB="0" distL="0" distR="0">
+            <wp:extent cx="4000500" cy="1762125"/>
+            <wp:effectExtent t="0" r="0" b="0" l="0"/>
+            <wp:docPr id="1" name="02-login-error.png" descr="Wrong password — the server's 401 message is shown" title="Wrong password — the server's 401 message is shown"/>
+            <wp:cNvGraphicFramePr>
+              <a:graphicFrameLocks xmlns:a="http://schemas.openxmlformats.org/drawingml/2006/main" noChangeAspect="1"/>
+            </wp:cNvGraphicFramePr>
+            <a:graphic xmlns:a="http://schemas.openxmlformats.org/drawingml/2006/main">
+              <a:graphicData uri="http://schemas.openxmlformats.org/drawingml/2006/picture">
+                <pic:pic xmlns:pic="http://schemas.openxmlformats.org/drawingml/2006/picture">
+                  <pic:nvPicPr>
+                    <pic:cNvPr id="0" name="" descr=""/>
+                    <pic:cNvPicPr>
+                      <a:picLocks noChangeAspect="1" noChangeArrowheads="1"/>
+                    </pic:cNvPicPr>
+                  </pic:nvPicPr>
+                  <pic:blipFill>
+                    <a:blip r:embed="rId25" cstate="none"/>
+                    <a:srcRect/>
+                    <a:stretch>
+                      <a:fillRect/>
+                    </a:stretch>
+                  </pic:blipFill>
+                  <pic:spPr bwMode="auto">
+                    <a:xfrm>
+                      <a:off x="0" y="0"/>
+                      <a:ext cx="4000500" cy="1762125"/>
+                    </a:xfrm>
+                    <a:prstGeom prst="rect">
+                      <a:avLst/>
+                    </a:prstGeom>
+                  </pic:spPr>
+                </pic:pic>
+              </a:graphicData>
+            </a:graphic>
+          </wp:inline>
+        </w:drawing>
+      </w:r>
+    </w:p>
+    <w:p>
+      <w:pPr>
+        <w:spacing w:after="220"/>
+        <w:jc w:val="center"/>
+      </w:pPr>
+      <w:r>
+        <w:rPr>
+          <w:i/>
+          <w:iCs/>
+          <w:color w:val="404040"/>
+          <w:sz w:val="18"/>
+          <w:szCs w:val="18"/>
+        </w:rPr>
+        <w:t xml:space="preserve">Figure 14: Wrong password — the server's 401 message is shown</w:t>
+      </w:r>
+    </w:p>
+    <w:p>
+      <w:pPr>
+        <w:pStyle w:val="Heading2"/>
+      </w:pPr>
+      <w:r>
+        <w:t xml:space="preserve">12.2 Admin Flow</w:t>
+      </w:r>
+    </w:p>
+    <w:p>
+      <w:pPr>
+        <w:pStyle w:val="ListParagraph"/>
+        <w:numPr>
+          <w:ilvl w:val="0"/>
+          <w:numId w:val="9"/>
+        </w:numPr>
+        <w:spacing w:after="60"/>
+      </w:pPr>
+      <w:r>
+        <w:t xml:space="preserve">Admin logs in and lands on </w:t>
+      </w:r>
+      <w:r>
+        <w:rPr>
+          <w:b/>
+          <w:bCs/>
+        </w:rPr>
+        <w:t xml:space="preserve">Students</w:t>
+      </w:r>
+      <w:r>
+        <w:t xml:space="preserve"> — 5 per page with Prev/Next.</w:t>
+      </w:r>
+    </w:p>
+    <w:p>
+      <w:pPr>
+        <w:pStyle w:val="ListParagraph"/>
+        <w:numPr>
+          <w:ilvl w:val="0"/>
+          <w:numId w:val="9"/>
+        </w:numPr>
+        <w:spacing w:after="60"/>
+      </w:pPr>
+      <w:r>
+        <w:t xml:space="preserve">Types in the search box to find a student by name, email or roll number.</w:t>
+      </w:r>
+    </w:p>
+    <w:p>
+      <w:pPr>
+        <w:pStyle w:val="ListParagraph"/>
+        <w:numPr>
+          <w:ilvl w:val="0"/>
+          <w:numId w:val="9"/>
+        </w:numPr>
+        <w:spacing w:after="60"/>
+      </w:pPr>
+      <w:r>
+        <w:t xml:space="preserve">Opens </w:t>
+      </w:r>
+      <w:r>
+        <w:rPr>
+          <w:b/>
+          <w:bCs/>
+        </w:rPr>
+        <w:t xml:space="preserve">Add User</w:t>
+      </w:r>
+      <w:r>
+        <w:t xml:space="preserve">, picks a role (the form changes for student vs faculty) and saves.</w:t>
+      </w:r>
+    </w:p>
+    <w:p>
+      <w:pPr>
+        <w:pStyle w:val="ListParagraph"/>
+        <w:numPr>
+          <w:ilvl w:val="0"/>
+          <w:numId w:val="9"/>
+        </w:numPr>
+        <w:spacing w:after="60"/>
+      </w:pPr>
+      <w:r>
+        <w:t xml:space="preserve">Opens </w:t>
+      </w:r>
+      <w:r>
+        <w:rPr>
+          <w:b/>
+          <w:bCs/>
+        </w:rPr>
+        <w:t xml:space="preserve">Courses</w:t>
+      </w:r>
+      <w:r>
+        <w:t xml:space="preserve"> to add a course and assign a teacher.</w:t>
+      </w:r>
+    </w:p>
+    <w:p>
+      <w:pPr>
+        <w:pStyle w:val="ListParagraph"/>
+        <w:numPr>
+          <w:ilvl w:val="0"/>
+          <w:numId w:val="9"/>
+        </w:numPr>
+        <w:spacing w:after="60"/>
+      </w:pPr>
+      <w:r>
+        <w:t xml:space="preserve">Can also post notices/events and handle complaints and leaves for the whole college.</w:t>
+      </w:r>
+    </w:p>
+    <w:p>
+      <w:pPr>
+        <w:keepNext/>
+        <w:spacing w:after="60" w:before="120"/>
+        <w:jc w:val="center"/>
+      </w:pPr>
+      <w:r>
+        <w:drawing>
+          <wp:inline distT="0" distB="0" distL="0" distR="0">
+            <wp:extent cx="5715000" cy="2667000"/>
+            <wp:effectExtent t="0" r="0" b="0" l="0"/>
+            <wp:docPr id="1" name="40-admin-students.png" descr="Admin — student list, page 1 of 2" title="Admin — student list, page 1 of 2"/>
+            <wp:cNvGraphicFramePr>
+              <a:graphicFrameLocks xmlns:a="http://schemas.openxmlformats.org/drawingml/2006/main" noChangeAspect="1"/>
+            </wp:cNvGraphicFramePr>
+            <a:graphic xmlns:a="http://schemas.openxmlformats.org/drawingml/2006/main">
+              <a:graphicData uri="http://schemas.openxmlformats.org/drawingml/2006/picture">
+                <pic:pic xmlns:pic="http://schemas.openxmlformats.org/drawingml/2006/picture">
+                  <pic:nvPicPr>
+                    <pic:cNvPr id="0" name="" descr=""/>
+                    <pic:cNvPicPr>
+                      <a:picLocks noChangeAspect="1" noChangeArrowheads="1"/>
+                    </pic:cNvPicPr>
+                  </pic:nvPicPr>
+                  <pic:blipFill>
+                    <a:blip r:embed="rId26" cstate="none"/>
+                    <a:srcRect/>
+                    <a:stretch>
+                      <a:fillRect/>
+                    </a:stretch>
+                  </pic:blipFill>
+                  <pic:spPr bwMode="auto">
+                    <a:xfrm>
+                      <a:off x="0" y="0"/>
                       <a:ext cx="5715000" cy="2667000"/>
                     </a:xfrm>
                     <a:prstGeom prst="rect">
@@ -43462,7 +44479,7 @@
           <w:sz w:val="18"/>
           <w:szCs w:val="18"/>
         </w:rPr>
-        <w:t xml:space="preserve">Figure 13: Admin — student list, page 1 of 2</w:t>
+        <w:t xml:space="preserve">Figure 15: Admin — student list, page 1 of 2</w:t>
       </w:r>
     </w:p>
     <w:p>
@@ -43525,7 +44542,7 @@
           <w:sz w:val="18"/>
           <w:szCs w:val="18"/>
         </w:rPr>
-        <w:t xml:space="preserve">Figure 14: Admin — searching "ro" (regex search)</w:t>
+        <w:t xml:space="preserve">Figure 16: Admin — searching "ro" (regex search)</w:t>
       </w:r>
     </w:p>
     <w:p>
@@ -43540,132 +44557,6 @@
             <wp:extent cx="5715000" cy="1514475"/>
             <wp:effectExtent t="0" r="0" b="0" l="0"/>
             <wp:docPr id="1" name="43-admin-add-user.png" descr="Admin — adding a new student" title="Admin — adding a new student"/>
-            <wp:cNvGraphicFramePr>
-              <a:graphicFrameLocks xmlns:a="http://schemas.openxmlformats.org/drawingml/2006/main" noChangeAspect="1"/>
-            </wp:cNvGraphicFramePr>
-            <a:graphic xmlns:a="http://schemas.openxmlformats.org/drawingml/2006/main">
-              <a:graphicData uri="http://schemas.openxmlformats.org/drawingml/2006/picture">
-                <pic:pic xmlns:pic="http://schemas.openxmlformats.org/drawingml/2006/picture">
-                  <pic:nvPicPr>
-                    <pic:cNvPr id="0" name="" descr=""/>
-                    <pic:cNvPicPr>
-                      <a:picLocks noChangeAspect="1" noChangeArrowheads="1"/>
-                    </pic:cNvPicPr>
-                  </pic:nvPicPr>
-                  <pic:blipFill>
-                    <a:blip r:embed="rId25" cstate="none"/>
-                    <a:srcRect/>
-                    <a:stretch>
-                      <a:fillRect/>
-                    </a:stretch>
-                  </pic:blipFill>
-                  <pic:spPr bwMode="auto">
-                    <a:xfrm>
-                      <a:off x="0" y="0"/>
-                      <a:ext cx="5715000" cy="1514475"/>
-                    </a:xfrm>
-                    <a:prstGeom prst="rect">
-                      <a:avLst/>
-                    </a:prstGeom>
-                  </pic:spPr>
-                </pic:pic>
-              </a:graphicData>
-            </a:graphic>
-          </wp:inline>
-        </w:drawing>
-      </w:r>
-    </w:p>
-    <w:p>
-      <w:pPr>
-        <w:spacing w:after="220"/>
-        <w:jc w:val="center"/>
-      </w:pPr>
-      <w:r>
-        <w:rPr>
-          <w:i/>
-          <w:iCs/>
-          <w:color w:val="404040"/>
-          <w:sz w:val="18"/>
-          <w:szCs w:val="18"/>
-        </w:rPr>
-        <w:t xml:space="preserve">Figure 15: Admin — adding a new student</w:t>
-      </w:r>
-    </w:p>
-    <w:p>
-      <w:pPr>
-        <w:keepNext/>
-        <w:spacing w:after="60" w:before="120"/>
-        <w:jc w:val="center"/>
-      </w:pPr>
-      <w:r>
-        <w:drawing>
-          <wp:inline distT="0" distB="0" distL="0" distR="0">
-            <wp:extent cx="5715000" cy="1752600"/>
-            <wp:effectExtent t="0" r="0" b="0" l="0"/>
-            <wp:docPr id="1" name="43b-admin-user-added.png" descr="Admin — user added successfully" title="Admin — user added successfully"/>
-            <wp:cNvGraphicFramePr>
-              <a:graphicFrameLocks xmlns:a="http://schemas.openxmlformats.org/drawingml/2006/main" noChangeAspect="1"/>
-            </wp:cNvGraphicFramePr>
-            <a:graphic xmlns:a="http://schemas.openxmlformats.org/drawingml/2006/main">
-              <a:graphicData uri="http://schemas.openxmlformats.org/drawingml/2006/picture">
-                <pic:pic xmlns:pic="http://schemas.openxmlformats.org/drawingml/2006/picture">
-                  <pic:nvPicPr>
-                    <pic:cNvPr id="0" name="" descr=""/>
-                    <pic:cNvPicPr>
-                      <a:picLocks noChangeAspect="1" noChangeArrowheads="1"/>
-                    </pic:cNvPicPr>
-                  </pic:nvPicPr>
-                  <pic:blipFill>
-                    <a:blip r:embed="rId26" cstate="none"/>
-                    <a:srcRect/>
-                    <a:stretch>
-                      <a:fillRect/>
-                    </a:stretch>
-                  </pic:blipFill>
-                  <pic:spPr bwMode="auto">
-                    <a:xfrm>
-                      <a:off x="0" y="0"/>
-                      <a:ext cx="5715000" cy="1752600"/>
-                    </a:xfrm>
-                    <a:prstGeom prst="rect">
-                      <a:avLst/>
-                    </a:prstGeom>
-                  </pic:spPr>
-                </pic:pic>
-              </a:graphicData>
-            </a:graphic>
-          </wp:inline>
-        </w:drawing>
-      </w:r>
-    </w:p>
-    <w:p>
-      <w:pPr>
-        <w:spacing w:after="220"/>
-        <w:jc w:val="center"/>
-      </w:pPr>
-      <w:r>
-        <w:rPr>
-          <w:i/>
-          <w:iCs/>
-          <w:color w:val="404040"/>
-          <w:sz w:val="18"/>
-          <w:szCs w:val="18"/>
-        </w:rPr>
-        <w:t xml:space="preserve">Figure 16: Admin — user added successfully</w:t>
-      </w:r>
-    </w:p>
-    <w:p>
-      <w:pPr>
-        <w:keepNext/>
-        <w:spacing w:after="60" w:before="120"/>
-        <w:jc w:val="center"/>
-      </w:pPr>
-      <w:r>
-        <w:drawing>
-          <wp:inline distT="0" distB="0" distL="0" distR="0">
-            <wp:extent cx="5715000" cy="2495550"/>
-            <wp:effectExtent t="0" r="0" b="0" l="0"/>
-            <wp:docPr id="1" name="44-admin-courses.png" descr="Admin — add course and course list" title="Admin — add course and course list"/>
             <wp:cNvGraphicFramePr>
               <a:graphicFrameLocks xmlns:a="http://schemas.openxmlformats.org/drawingml/2006/main" noChangeAspect="1"/>
             </wp:cNvGraphicFramePr>
@@ -43688,7 +44579,7 @@
                   <pic:spPr bwMode="auto">
                     <a:xfrm>
                       <a:off x="0" y="0"/>
-                      <a:ext cx="5715000" cy="2495550"/>
+                      <a:ext cx="5715000" cy="1514475"/>
                     </a:xfrm>
                     <a:prstGeom prst="rect">
                       <a:avLst/>
@@ -43714,7 +44605,7 @@
           <w:sz w:val="18"/>
           <w:szCs w:val="18"/>
         </w:rPr>
-        <w:t xml:space="preserve">Figure 17: Admin — add course and course list</w:t>
+        <w:t xml:space="preserve">Figure 17: Admin — adding a new student</w:t>
       </w:r>
     </w:p>
     <w:p>
@@ -43726,9 +44617,9 @@
       <w:r>
         <w:drawing>
           <wp:inline distT="0" distB="0" distL="0" distR="0">
-            <wp:extent cx="5715000" cy="2733675"/>
+            <wp:extent cx="5715000" cy="1752600"/>
             <wp:effectExtent t="0" r="0" b="0" l="0"/>
-            <wp:docPr id="1" name="45-admin-notices.png" descr="Admin — posting and managing notices" title="Admin — posting and managing notices"/>
+            <wp:docPr id="1" name="43b-admin-user-added.png" descr="Admin — user added successfully" title="Admin — user added successfully"/>
             <wp:cNvGraphicFramePr>
               <a:graphicFrameLocks xmlns:a="http://schemas.openxmlformats.org/drawingml/2006/main" noChangeAspect="1"/>
             </wp:cNvGraphicFramePr>
@@ -43751,7 +44642,7 @@
                   <pic:spPr bwMode="auto">
                     <a:xfrm>
                       <a:off x="0" y="0"/>
-                      <a:ext cx="5715000" cy="2733675"/>
+                      <a:ext cx="5715000" cy="1752600"/>
                     </a:xfrm>
                     <a:prstGeom prst="rect">
                       <a:avLst/>
@@ -43777,127 +44668,7 @@
           <w:sz w:val="18"/>
           <w:szCs w:val="18"/>
         </w:rPr>
-        <w:t xml:space="preserve">Figure 18: Admin — posting and managing notices</w:t>
-      </w:r>
-    </w:p>
-    <w:p>
-      <w:pPr>
-        <w:pStyle w:val="Heading2"/>
-      </w:pPr>
-      <w:r>
-        <w:t xml:space="preserve">12.3 HOD Flow</w:t>
-      </w:r>
-    </w:p>
-    <w:p>
-      <w:pPr>
-        <w:pStyle w:val="ListParagraph"/>
-        <w:numPr>
-          <w:ilvl w:val="0"/>
-          <w:numId w:val="9"/>
-        </w:numPr>
-        <w:spacing w:after="60"/>
-      </w:pPr>
-      <w:r>
-        <w:t xml:space="preserve">HOD logs in and lands on the </w:t>
-      </w:r>
-      <w:r>
-        <w:rPr>
-          <w:b/>
-          <w:bCs/>
-        </w:rPr>
-        <w:t xml:space="preserve">Attendance Report</w:t>
-      </w:r>
-      <w:r>
-        <w:t xml:space="preserve"> for their department's courses.</w:t>
-      </w:r>
-    </w:p>
-    <w:p>
-      <w:pPr>
-        <w:pStyle w:val="ListParagraph"/>
-        <w:numPr>
-          <w:ilvl w:val="0"/>
-          <w:numId w:val="9"/>
-        </w:numPr>
-        <w:spacing w:after="60"/>
-      </w:pPr>
-      <w:r>
-        <w:t xml:space="preserve">Checks </w:t>
-      </w:r>
-      <w:r>
-        <w:rPr>
-          <w:b/>
-          <w:bCs/>
-        </w:rPr>
-        <w:t xml:space="preserve">Students</w:t>
-      </w:r>
-      <w:r>
-        <w:t xml:space="preserve"> — only CSE students appear, because the server forces the department.</w:t>
-      </w:r>
-    </w:p>
-    <w:p>
-      <w:pPr>
-        <w:pStyle w:val="ListParagraph"/>
-        <w:numPr>
-          <w:ilvl w:val="0"/>
-          <w:numId w:val="9"/>
-        </w:numPr>
-        <w:spacing w:after="60"/>
-      </w:pPr>
-      <w:r>
-        <w:t xml:space="preserve">Opens </w:t>
-      </w:r>
-      <w:r>
-        <w:rPr>
-          <w:b/>
-          <w:bCs/>
-        </w:rPr>
-        <w:t xml:space="preserve">Complaints</w:t>
-      </w:r>
-      <w:r>
-        <w:t xml:space="preserve">, clicks </w:t>
-      </w:r>
-      <w:r>
-        <w:rPr>
-          <w:b/>
-          <w:bCs/>
-        </w:rPr>
-        <w:t xml:space="preserve">Start</w:t>
-      </w:r>
-      <w:r>
-        <w:t xml:space="preserve"> (in-progress) and later </w:t>
-      </w:r>
-      <w:r>
-        <w:rPr>
-          <w:b/>
-          <w:bCs/>
-        </w:rPr>
-        <w:t xml:space="preserve">Resolve</w:t>
-      </w:r>
-      <w:r>
-        <w:t xml:space="preserve">.</w:t>
-      </w:r>
-    </w:p>
-    <w:p>
-      <w:pPr>
-        <w:pStyle w:val="ListParagraph"/>
-        <w:numPr>
-          <w:ilvl w:val="0"/>
-          <w:numId w:val="9"/>
-        </w:numPr>
-        <w:spacing w:after="60"/>
-      </w:pPr>
-      <w:r>
-        <w:t xml:space="preserve">Opens </w:t>
-      </w:r>
-      <w:r>
-        <w:rPr>
-          <w:b/>
-          <w:bCs/>
-        </w:rPr>
-        <w:t xml:space="preserve">Leaves</w:t>
-      </w:r>
-      <w:r>
-        <w:t xml:space="preserve"> and approves or rejects requests from students and faculty of the department.</w:t>
+        <w:t xml:space="preserve">Figure 18: Admin — user added successfully</w:t>
       </w:r>
     </w:p>
     <w:p>
@@ -43909,9 +44680,9 @@
       <w:r>
         <w:drawing>
           <wp:inline distT="0" distB="0" distL="0" distR="0">
-            <wp:extent cx="5715000" cy="3486150"/>
+            <wp:extent cx="5715000" cy="2495550"/>
             <wp:effectExtent t="0" r="0" b="0" l="0"/>
-            <wp:docPr id="1" name="30-hod-report.png" descr="HOD — department attendance report" title="HOD — department attendance report"/>
+            <wp:docPr id="1" name="44-admin-courses.png" descr="Admin — add course and course list" title="Admin — add course and course list"/>
             <wp:cNvGraphicFramePr>
               <a:graphicFrameLocks xmlns:a="http://schemas.openxmlformats.org/drawingml/2006/main" noChangeAspect="1"/>
             </wp:cNvGraphicFramePr>
@@ -43934,6 +44705,252 @@
                   <pic:spPr bwMode="auto">
                     <a:xfrm>
                       <a:off x="0" y="0"/>
+                      <a:ext cx="5715000" cy="2495550"/>
+                    </a:xfrm>
+                    <a:prstGeom prst="rect">
+                      <a:avLst/>
+                    </a:prstGeom>
+                  </pic:spPr>
+                </pic:pic>
+              </a:graphicData>
+            </a:graphic>
+          </wp:inline>
+        </w:drawing>
+      </w:r>
+    </w:p>
+    <w:p>
+      <w:pPr>
+        <w:spacing w:after="220"/>
+        <w:jc w:val="center"/>
+      </w:pPr>
+      <w:r>
+        <w:rPr>
+          <w:i/>
+          <w:iCs/>
+          <w:color w:val="404040"/>
+          <w:sz w:val="18"/>
+          <w:szCs w:val="18"/>
+        </w:rPr>
+        <w:t xml:space="preserve">Figure 19: Admin — add course and course list</w:t>
+      </w:r>
+    </w:p>
+    <w:p>
+      <w:pPr>
+        <w:keepNext/>
+        <w:spacing w:after="60" w:before="120"/>
+        <w:jc w:val="center"/>
+      </w:pPr>
+      <w:r>
+        <w:drawing>
+          <wp:inline distT="0" distB="0" distL="0" distR="0">
+            <wp:extent cx="5715000" cy="2733675"/>
+            <wp:effectExtent t="0" r="0" b="0" l="0"/>
+            <wp:docPr id="1" name="45-admin-notices.png" descr="Admin — posting and managing notices" title="Admin — posting and managing notices"/>
+            <wp:cNvGraphicFramePr>
+              <a:graphicFrameLocks xmlns:a="http://schemas.openxmlformats.org/drawingml/2006/main" noChangeAspect="1"/>
+            </wp:cNvGraphicFramePr>
+            <a:graphic xmlns:a="http://schemas.openxmlformats.org/drawingml/2006/main">
+              <a:graphicData uri="http://schemas.openxmlformats.org/drawingml/2006/picture">
+                <pic:pic xmlns:pic="http://schemas.openxmlformats.org/drawingml/2006/picture">
+                  <pic:nvPicPr>
+                    <pic:cNvPr id="0" name="" descr=""/>
+                    <pic:cNvPicPr>
+                      <a:picLocks noChangeAspect="1" noChangeArrowheads="1"/>
+                    </pic:cNvPicPr>
+                  </pic:nvPicPr>
+                  <pic:blipFill>
+                    <a:blip r:embed="rId30" cstate="none"/>
+                    <a:srcRect/>
+                    <a:stretch>
+                      <a:fillRect/>
+                    </a:stretch>
+                  </pic:blipFill>
+                  <pic:spPr bwMode="auto">
+                    <a:xfrm>
+                      <a:off x="0" y="0"/>
+                      <a:ext cx="5715000" cy="2733675"/>
+                    </a:xfrm>
+                    <a:prstGeom prst="rect">
+                      <a:avLst/>
+                    </a:prstGeom>
+                  </pic:spPr>
+                </pic:pic>
+              </a:graphicData>
+            </a:graphic>
+          </wp:inline>
+        </w:drawing>
+      </w:r>
+    </w:p>
+    <w:p>
+      <w:pPr>
+        <w:spacing w:after="220"/>
+        <w:jc w:val="center"/>
+      </w:pPr>
+      <w:r>
+        <w:rPr>
+          <w:i/>
+          <w:iCs/>
+          <w:color w:val="404040"/>
+          <w:sz w:val="18"/>
+          <w:szCs w:val="18"/>
+        </w:rPr>
+        <w:t xml:space="preserve">Figure 20: Admin — posting and managing notices</w:t>
+      </w:r>
+    </w:p>
+    <w:p>
+      <w:pPr>
+        <w:pStyle w:val="Heading2"/>
+      </w:pPr>
+      <w:r>
+        <w:t xml:space="preserve">12.3 HOD Flow</w:t>
+      </w:r>
+    </w:p>
+    <w:p>
+      <w:pPr>
+        <w:pStyle w:val="ListParagraph"/>
+        <w:numPr>
+          <w:ilvl w:val="0"/>
+          <w:numId w:val="10"/>
+        </w:numPr>
+        <w:spacing w:after="60"/>
+      </w:pPr>
+      <w:r>
+        <w:t xml:space="preserve">HOD logs in and lands on the </w:t>
+      </w:r>
+      <w:r>
+        <w:rPr>
+          <w:b/>
+          <w:bCs/>
+        </w:rPr>
+        <w:t xml:space="preserve">Attendance Report</w:t>
+      </w:r>
+      <w:r>
+        <w:t xml:space="preserve"> for their department's courses.</w:t>
+      </w:r>
+    </w:p>
+    <w:p>
+      <w:pPr>
+        <w:pStyle w:val="ListParagraph"/>
+        <w:numPr>
+          <w:ilvl w:val="0"/>
+          <w:numId w:val="10"/>
+        </w:numPr>
+        <w:spacing w:after="60"/>
+      </w:pPr>
+      <w:r>
+        <w:t xml:space="preserve">Checks </w:t>
+      </w:r>
+      <w:r>
+        <w:rPr>
+          <w:b/>
+          <w:bCs/>
+        </w:rPr>
+        <w:t xml:space="preserve">Students</w:t>
+      </w:r>
+      <w:r>
+        <w:t xml:space="preserve"> — only CSE students appear, because the server forces the department.</w:t>
+      </w:r>
+    </w:p>
+    <w:p>
+      <w:pPr>
+        <w:pStyle w:val="ListParagraph"/>
+        <w:numPr>
+          <w:ilvl w:val="0"/>
+          <w:numId w:val="10"/>
+        </w:numPr>
+        <w:spacing w:after="60"/>
+      </w:pPr>
+      <w:r>
+        <w:t xml:space="preserve">Opens </w:t>
+      </w:r>
+      <w:r>
+        <w:rPr>
+          <w:b/>
+          <w:bCs/>
+        </w:rPr>
+        <w:t xml:space="preserve">Complaints</w:t>
+      </w:r>
+      <w:r>
+        <w:t xml:space="preserve">, clicks </w:t>
+      </w:r>
+      <w:r>
+        <w:rPr>
+          <w:b/>
+          <w:bCs/>
+        </w:rPr>
+        <w:t xml:space="preserve">Start</w:t>
+      </w:r>
+      <w:r>
+        <w:t xml:space="preserve"> (in-progress) and later </w:t>
+      </w:r>
+      <w:r>
+        <w:rPr>
+          <w:b/>
+          <w:bCs/>
+        </w:rPr>
+        <w:t xml:space="preserve">Resolve</w:t>
+      </w:r>
+      <w:r>
+        <w:t xml:space="preserve">.</w:t>
+      </w:r>
+    </w:p>
+    <w:p>
+      <w:pPr>
+        <w:pStyle w:val="ListParagraph"/>
+        <w:numPr>
+          <w:ilvl w:val="0"/>
+          <w:numId w:val="10"/>
+        </w:numPr>
+        <w:spacing w:after="60"/>
+      </w:pPr>
+      <w:r>
+        <w:t xml:space="preserve">Opens </w:t>
+      </w:r>
+      <w:r>
+        <w:rPr>
+          <w:b/>
+          <w:bCs/>
+        </w:rPr>
+        <w:t xml:space="preserve">Leaves</w:t>
+      </w:r>
+      <w:r>
+        <w:t xml:space="preserve"> and approves or rejects requests from students and faculty of the department.</w:t>
+      </w:r>
+    </w:p>
+    <w:p>
+      <w:pPr>
+        <w:keepNext/>
+        <w:spacing w:after="60" w:before="120"/>
+        <w:jc w:val="center"/>
+      </w:pPr>
+      <w:r>
+        <w:drawing>
+          <wp:inline distT="0" distB="0" distL="0" distR="0">
+            <wp:extent cx="5715000" cy="3486150"/>
+            <wp:effectExtent t="0" r="0" b="0" l="0"/>
+            <wp:docPr id="1" name="30-hod-report.png" descr="HOD — department attendance report" title="HOD — department attendance report"/>
+            <wp:cNvGraphicFramePr>
+              <a:graphicFrameLocks xmlns:a="http://schemas.openxmlformats.org/drawingml/2006/main" noChangeAspect="1"/>
+            </wp:cNvGraphicFramePr>
+            <a:graphic xmlns:a="http://schemas.openxmlformats.org/drawingml/2006/main">
+              <a:graphicData uri="http://schemas.openxmlformats.org/drawingml/2006/picture">
+                <pic:pic xmlns:pic="http://schemas.openxmlformats.org/drawingml/2006/picture">
+                  <pic:nvPicPr>
+                    <pic:cNvPr id="0" name="" descr=""/>
+                    <pic:cNvPicPr>
+                      <a:picLocks noChangeAspect="1" noChangeArrowheads="1"/>
+                    </pic:cNvPicPr>
+                  </pic:nvPicPr>
+                  <pic:blipFill>
+                    <a:blip r:embed="rId31" cstate="none"/>
+                    <a:srcRect/>
+                    <a:stretch>
+                      <a:fillRect/>
+                    </a:stretch>
+                  </pic:blipFill>
+                  <pic:spPr bwMode="auto">
+                    <a:xfrm>
+                      <a:off x="0" y="0"/>
                       <a:ext cx="5715000" cy="3486150"/>
                     </a:xfrm>
                     <a:prstGeom prst="rect">
@@ -43960,7 +44977,7 @@
           <w:sz w:val="18"/>
           <w:szCs w:val="18"/>
         </w:rPr>
-        <w:t xml:space="preserve">Figure 19: HOD — department attendance report</w:t>
+        <w:t xml:space="preserve">Figure 21: HOD — department attendance report</w:t>
       </w:r>
     </w:p>
     <w:p>
@@ -44023,7 +45040,7 @@
           <w:sz w:val="18"/>
           <w:szCs w:val="18"/>
         </w:rPr>
-        <w:t xml:space="preserve">Figure 20: HOD — only own department's students</w:t>
+        <w:t xml:space="preserve">Figure 22: HOD — only own department's students</w:t>
       </w:r>
     </w:p>
     <w:p>
@@ -44038,255 +45055,6 @@
             <wp:extent cx="5715000" cy="1676400"/>
             <wp:effectExtent t="0" r="0" b="0" l="0"/>
             <wp:docPr id="1" name="32-hod-complaints.png" descr="HOD — complaint moved to in-progress" title="HOD — complaint moved to in-progress"/>
-            <wp:cNvGraphicFramePr>
-              <a:graphicFrameLocks xmlns:a="http://schemas.openxmlformats.org/drawingml/2006/main" noChangeAspect="1"/>
-            </wp:cNvGraphicFramePr>
-            <a:graphic xmlns:a="http://schemas.openxmlformats.org/drawingml/2006/main">
-              <a:graphicData uri="http://schemas.openxmlformats.org/drawingml/2006/picture">
-                <pic:pic xmlns:pic="http://schemas.openxmlformats.org/drawingml/2006/picture">
-                  <pic:nvPicPr>
-                    <pic:cNvPr id="0" name="" descr=""/>
-                    <pic:cNvPicPr>
-                      <a:picLocks noChangeAspect="1" noChangeArrowheads="1"/>
-                    </pic:cNvPicPr>
-                  </pic:nvPicPr>
-                  <pic:blipFill>
-                    <a:blip r:embed="rId30" cstate="none"/>
-                    <a:srcRect/>
-                    <a:stretch>
-                      <a:fillRect/>
-                    </a:stretch>
-                  </pic:blipFill>
-                  <pic:spPr bwMode="auto">
-                    <a:xfrm>
-                      <a:off x="0" y="0"/>
-                      <a:ext cx="5715000" cy="1676400"/>
-                    </a:xfrm>
-                    <a:prstGeom prst="rect">
-                      <a:avLst/>
-                    </a:prstGeom>
-                  </pic:spPr>
-                </pic:pic>
-              </a:graphicData>
-            </a:graphic>
-          </wp:inline>
-        </w:drawing>
-      </w:r>
-    </w:p>
-    <w:p>
-      <w:pPr>
-        <w:spacing w:after="220"/>
-        <w:jc w:val="center"/>
-      </w:pPr>
-      <w:r>
-        <w:rPr>
-          <w:i/>
-          <w:iCs/>
-          <w:color w:val="404040"/>
-          <w:sz w:val="18"/>
-          <w:szCs w:val="18"/>
-        </w:rPr>
-        <w:t xml:space="preserve">Figure 21: HOD — complaint moved to in-progress</w:t>
-      </w:r>
-    </w:p>
-    <w:p>
-      <w:pPr>
-        <w:keepNext/>
-        <w:spacing w:after="60" w:before="120"/>
-        <w:jc w:val="center"/>
-      </w:pPr>
-      <w:r>
-        <w:drawing>
-          <wp:inline distT="0" distB="0" distL="0" distR="0">
-            <wp:extent cx="5715000" cy="1838325"/>
-            <wp:effectExtent t="0" r="0" b="0" l="0"/>
-            <wp:docPr id="1" name="33-hod-leaves.png" descr="HOD — approving a leave request" title="HOD — approving a leave request"/>
-            <wp:cNvGraphicFramePr>
-              <a:graphicFrameLocks xmlns:a="http://schemas.openxmlformats.org/drawingml/2006/main" noChangeAspect="1"/>
-            </wp:cNvGraphicFramePr>
-            <a:graphic xmlns:a="http://schemas.openxmlformats.org/drawingml/2006/main">
-              <a:graphicData uri="http://schemas.openxmlformats.org/drawingml/2006/picture">
-                <pic:pic xmlns:pic="http://schemas.openxmlformats.org/drawingml/2006/picture">
-                  <pic:nvPicPr>
-                    <pic:cNvPr id="0" name="" descr=""/>
-                    <pic:cNvPicPr>
-                      <a:picLocks noChangeAspect="1" noChangeArrowheads="1"/>
-                    </pic:cNvPicPr>
-                  </pic:nvPicPr>
-                  <pic:blipFill>
-                    <a:blip r:embed="rId31" cstate="none"/>
-                    <a:srcRect/>
-                    <a:stretch>
-                      <a:fillRect/>
-                    </a:stretch>
-                  </pic:blipFill>
-                  <pic:spPr bwMode="auto">
-                    <a:xfrm>
-                      <a:off x="0" y="0"/>
-                      <a:ext cx="5715000" cy="1838325"/>
-                    </a:xfrm>
-                    <a:prstGeom prst="rect">
-                      <a:avLst/>
-                    </a:prstGeom>
-                  </pic:spPr>
-                </pic:pic>
-              </a:graphicData>
-            </a:graphic>
-          </wp:inline>
-        </w:drawing>
-      </w:r>
-    </w:p>
-    <w:p>
-      <w:pPr>
-        <w:spacing w:after="220"/>
-        <w:jc w:val="center"/>
-      </w:pPr>
-      <w:r>
-        <w:rPr>
-          <w:i/>
-          <w:iCs/>
-          <w:color w:val="404040"/>
-          <w:sz w:val="18"/>
-          <w:szCs w:val="18"/>
-        </w:rPr>
-        <w:t xml:space="preserve">Figure 22: HOD — approving a leave request</w:t>
-      </w:r>
-    </w:p>
-    <w:p>
-      <w:pPr>
-        <w:pStyle w:val="Heading2"/>
-      </w:pPr>
-      <w:r>
-        <w:t xml:space="preserve">12.4 Faculty Flow</w:t>
-      </w:r>
-    </w:p>
-    <w:p>
-      <w:pPr>
-        <w:pStyle w:val="ListParagraph"/>
-        <w:numPr>
-          <w:ilvl w:val="0"/>
-          <w:numId w:val="10"/>
-        </w:numPr>
-        <w:spacing w:after="60"/>
-      </w:pPr>
-      <w:r>
-        <w:t xml:space="preserve">Faculty logs in to the </w:t>
-      </w:r>
-      <w:r>
-        <w:rPr>
-          <w:b/>
-          <w:bCs/>
-        </w:rPr>
-        <w:t xml:space="preserve">Dashboard</w:t>
-      </w:r>
-      <w:r>
-        <w:t xml:space="preserve">: total students, class average, at-risk count and a red list of students below 75%.</w:t>
-      </w:r>
-    </w:p>
-    <w:p>
-      <w:pPr>
-        <w:pStyle w:val="ListParagraph"/>
-        <w:numPr>
-          <w:ilvl w:val="0"/>
-          <w:numId w:val="10"/>
-        </w:numPr>
-        <w:spacing w:after="60"/>
-      </w:pPr>
-      <w:r>
-        <w:t xml:space="preserve">Opens </w:t>
-      </w:r>
-      <w:r>
-        <w:rPr>
-          <w:b/>
-          <w:bCs/>
-        </w:rPr>
-        <w:t xml:space="preserve">Mark Attendance</w:t>
-      </w:r>
-      <w:r>
-        <w:t xml:space="preserve">, chooses the course and date, ticks absent students and clicks </w:t>
-      </w:r>
-      <w:r>
-        <w:rPr>
-          <w:b/>
-          <w:bCs/>
-        </w:rPr>
-        <w:t xml:space="preserve">Save</w:t>
-      </w:r>
-      <w:r>
-        <w:t xml:space="preserve">. Opening the same date later shows the saved ticks.</w:t>
-      </w:r>
-    </w:p>
-    <w:p>
-      <w:pPr>
-        <w:pStyle w:val="ListParagraph"/>
-        <w:numPr>
-          <w:ilvl w:val="0"/>
-          <w:numId w:val="10"/>
-        </w:numPr>
-        <w:spacing w:after="60"/>
-      </w:pPr>
-      <w:r>
-        <w:t xml:space="preserve">Opens </w:t>
-      </w:r>
-      <w:r>
-        <w:rPr>
-          <w:b/>
-          <w:bCs/>
-        </w:rPr>
-        <w:t xml:space="preserve">Assignments</w:t>
-      </w:r>
-      <w:r>
-        <w:t xml:space="preserve"> to create one and to see who submitted.</w:t>
-      </w:r>
-    </w:p>
-    <w:p>
-      <w:pPr>
-        <w:pStyle w:val="ListParagraph"/>
-        <w:numPr>
-          <w:ilvl w:val="0"/>
-          <w:numId w:val="10"/>
-        </w:numPr>
-        <w:spacing w:after="60"/>
-      </w:pPr>
-      <w:r>
-        <w:t xml:space="preserve">Opens </w:t>
-      </w:r>
-      <w:r>
-        <w:rPr>
-          <w:b/>
-          <w:bCs/>
-        </w:rPr>
-        <w:t xml:space="preserve">Results</w:t>
-      </w:r>
-      <w:r>
-        <w:t xml:space="preserve"> to type marks for each student.</w:t>
-      </w:r>
-    </w:p>
-    <w:p>
-      <w:pPr>
-        <w:pStyle w:val="ListParagraph"/>
-        <w:numPr>
-          <w:ilvl w:val="0"/>
-          <w:numId w:val="10"/>
-        </w:numPr>
-        <w:spacing w:after="60"/>
-      </w:pPr>
-      <w:r>
-        <w:t xml:space="preserve">Can apply for leave and post notices/events.</w:t>
-      </w:r>
-    </w:p>
-    <w:p>
-      <w:pPr>
-        <w:keepNext/>
-        <w:spacing w:after="60" w:before="120"/>
-        <w:jc w:val="center"/>
-      </w:pPr>
-      <w:r>
-        <w:drawing>
-          <wp:inline distT="0" distB="0" distL="0" distR="0">
-            <wp:extent cx="5715000" cy="3810000"/>
-            <wp:effectExtent t="0" r="0" b="0" l="0"/>
-            <wp:docPr id="1" name="21-faculty-mark-attendance.png" descr="Faculty — marking attendance (one student absent)" title="Faculty — marking attendance (one student absent)"/>
             <wp:cNvGraphicFramePr>
               <a:graphicFrameLocks xmlns:a="http://schemas.openxmlformats.org/drawingml/2006/main" noChangeAspect="1"/>
             </wp:cNvGraphicFramePr>
@@ -44309,7 +45077,7 @@
                   <pic:spPr bwMode="auto">
                     <a:xfrm>
                       <a:off x="0" y="0"/>
-                      <a:ext cx="5715000" cy="3810000"/>
+                      <a:ext cx="5715000" cy="1676400"/>
                     </a:xfrm>
                     <a:prstGeom prst="rect">
                       <a:avLst/>
@@ -44335,7 +45103,7 @@
           <w:sz w:val="18"/>
           <w:szCs w:val="18"/>
         </w:rPr>
-        <w:t xml:space="preserve">Figure 23: Faculty — marking attendance (one student absent)</w:t>
+        <w:t xml:space="preserve">Figure 23: HOD — complaint moved to in-progress</w:t>
       </w:r>
     </w:p>
     <w:p>
@@ -44347,9 +45115,9 @@
       <w:r>
         <w:drawing>
           <wp:inline distT="0" distB="0" distL="0" distR="0">
-            <wp:extent cx="5715000" cy="2400300"/>
+            <wp:extent cx="5715000" cy="1838325"/>
             <wp:effectExtent t="0" r="0" b="0" l="0"/>
-            <wp:docPr id="1" name="22-faculty-assignments.png" descr="Faculty — assignment with a student's submission" title="Faculty — assignment with a student's submission"/>
+            <wp:docPr id="1" name="33-hod-leaves.png" descr="HOD — approving a leave request" title="HOD — approving a leave request"/>
             <wp:cNvGraphicFramePr>
               <a:graphicFrameLocks xmlns:a="http://schemas.openxmlformats.org/drawingml/2006/main" noChangeAspect="1"/>
             </wp:cNvGraphicFramePr>
@@ -44372,7 +45140,7 @@
                   <pic:spPr bwMode="auto">
                     <a:xfrm>
                       <a:off x="0" y="0"/>
-                      <a:ext cx="5715000" cy="2400300"/>
+                      <a:ext cx="5715000" cy="1838325"/>
                     </a:xfrm>
                     <a:prstGeom prst="rect">
                       <a:avLst/>
@@ -44398,7 +45166,130 @@
           <w:sz w:val="18"/>
           <w:szCs w:val="18"/>
         </w:rPr>
-        <w:t xml:space="preserve">Figure 24: Faculty — assignment with a student's submission</w:t>
+        <w:t xml:space="preserve">Figure 24: HOD — approving a leave request</w:t>
+      </w:r>
+    </w:p>
+    <w:p>
+      <w:pPr>
+        <w:pStyle w:val="Heading2"/>
+      </w:pPr>
+      <w:r>
+        <w:t xml:space="preserve">12.4 Faculty Flow</w:t>
+      </w:r>
+    </w:p>
+    <w:p>
+      <w:pPr>
+        <w:pStyle w:val="ListParagraph"/>
+        <w:numPr>
+          <w:ilvl w:val="0"/>
+          <w:numId w:val="11"/>
+        </w:numPr>
+        <w:spacing w:after="60"/>
+      </w:pPr>
+      <w:r>
+        <w:t xml:space="preserve">Faculty logs in to the </w:t>
+      </w:r>
+      <w:r>
+        <w:rPr>
+          <w:b/>
+          <w:bCs/>
+        </w:rPr>
+        <w:t xml:space="preserve">Dashboard</w:t>
+      </w:r>
+      <w:r>
+        <w:t xml:space="preserve">: total students, class average, at-risk count and a red list of students below 75%.</w:t>
+      </w:r>
+    </w:p>
+    <w:p>
+      <w:pPr>
+        <w:pStyle w:val="ListParagraph"/>
+        <w:numPr>
+          <w:ilvl w:val="0"/>
+          <w:numId w:val="11"/>
+        </w:numPr>
+        <w:spacing w:after="60"/>
+      </w:pPr>
+      <w:r>
+        <w:t xml:space="preserve">Opens </w:t>
+      </w:r>
+      <w:r>
+        <w:rPr>
+          <w:b/>
+          <w:bCs/>
+        </w:rPr>
+        <w:t xml:space="preserve">Mark Attendance</w:t>
+      </w:r>
+      <w:r>
+        <w:t xml:space="preserve">, chooses the course and date, ticks absent students and clicks </w:t>
+      </w:r>
+      <w:r>
+        <w:rPr>
+          <w:b/>
+          <w:bCs/>
+        </w:rPr>
+        <w:t xml:space="preserve">Save</w:t>
+      </w:r>
+      <w:r>
+        <w:t xml:space="preserve">. Opening the same date later shows the saved ticks.</w:t>
+      </w:r>
+    </w:p>
+    <w:p>
+      <w:pPr>
+        <w:pStyle w:val="ListParagraph"/>
+        <w:numPr>
+          <w:ilvl w:val="0"/>
+          <w:numId w:val="11"/>
+        </w:numPr>
+        <w:spacing w:after="60"/>
+      </w:pPr>
+      <w:r>
+        <w:t xml:space="preserve">Opens </w:t>
+      </w:r>
+      <w:r>
+        <w:rPr>
+          <w:b/>
+          <w:bCs/>
+        </w:rPr>
+        <w:t xml:space="preserve">Assignments</w:t>
+      </w:r>
+      <w:r>
+        <w:t xml:space="preserve"> to create one and to see who submitted.</w:t>
+      </w:r>
+    </w:p>
+    <w:p>
+      <w:pPr>
+        <w:pStyle w:val="ListParagraph"/>
+        <w:numPr>
+          <w:ilvl w:val="0"/>
+          <w:numId w:val="11"/>
+        </w:numPr>
+        <w:spacing w:after="60"/>
+      </w:pPr>
+      <w:r>
+        <w:t xml:space="preserve">Opens </w:t>
+      </w:r>
+      <w:r>
+        <w:rPr>
+          <w:b/>
+          <w:bCs/>
+        </w:rPr>
+        <w:t xml:space="preserve">Results</w:t>
+      </w:r>
+      <w:r>
+        <w:t xml:space="preserve"> to type marks for each student.</w:t>
+      </w:r>
+    </w:p>
+    <w:p>
+      <w:pPr>
+        <w:pStyle w:val="ListParagraph"/>
+        <w:numPr>
+          <w:ilvl w:val="0"/>
+          <w:numId w:val="11"/>
+        </w:numPr>
+        <w:spacing w:after="60"/>
+      </w:pPr>
+      <w:r>
+        <w:t xml:space="preserve">Can apply for leave and post notices/events.</w:t>
       </w:r>
     </w:p>
     <w:p>
@@ -44410,9 +45301,9 @@
       <w:r>
         <w:drawing>
           <wp:inline distT="0" distB="0" distL="0" distR="0">
-            <wp:extent cx="5715000" cy="3743325"/>
+            <wp:extent cx="5715000" cy="3810000"/>
             <wp:effectExtent t="0" r="0" b="0" l="0"/>
-            <wp:docPr id="1" name="23-faculty-results.png" descr="Faculty — entering marks" title="Faculty — entering marks"/>
+            <wp:docPr id="1" name="21-faculty-mark-attendance.png" descr="Faculty — marking attendance (one student absent)" title="Faculty — marking attendance (one student absent)"/>
             <wp:cNvGraphicFramePr>
               <a:graphicFrameLocks xmlns:a="http://schemas.openxmlformats.org/drawingml/2006/main" noChangeAspect="1"/>
             </wp:cNvGraphicFramePr>
@@ -44435,7 +45326,7 @@
                   <pic:spPr bwMode="auto">
                     <a:xfrm>
                       <a:off x="0" y="0"/>
-                      <a:ext cx="5715000" cy="3743325"/>
+                      <a:ext cx="5715000" cy="3810000"/>
                     </a:xfrm>
                     <a:prstGeom prst="rect">
                       <a:avLst/>
@@ -44461,160 +45352,7 @@
           <w:sz w:val="18"/>
           <w:szCs w:val="18"/>
         </w:rPr>
-        <w:t xml:space="preserve">Figure 25: Faculty — entering marks</w:t>
-      </w:r>
-    </w:p>
-    <w:p>
-      <w:pPr>
-        <w:pStyle w:val="Heading2"/>
-      </w:pPr>
-      <w:r>
-        <w:t xml:space="preserve">12.5 Student Flow</w:t>
-      </w:r>
-    </w:p>
-    <w:p>
-      <w:pPr>
-        <w:pStyle w:val="ListParagraph"/>
-        <w:numPr>
-          <w:ilvl w:val="0"/>
-          <w:numId w:val="11"/>
-        </w:numPr>
-        <w:spacing w:after="60"/>
-      </w:pPr>
-      <w:r>
-        <w:t xml:space="preserve">Student logs in to </w:t>
-      </w:r>
-      <w:r>
-        <w:rPr>
-          <w:b/>
-          <w:bCs/>
-        </w:rPr>
-        <w:t xml:space="preserve">My Attendance</w:t>
-      </w:r>
-      <w:r>
-        <w:t xml:space="preserve"> — percentage per course, red if below 75%.</w:t>
-      </w:r>
-    </w:p>
-    <w:p>
-      <w:pPr>
-        <w:pStyle w:val="ListParagraph"/>
-        <w:numPr>
-          <w:ilvl w:val="0"/>
-          <w:numId w:val="11"/>
-        </w:numPr>
-        <w:spacing w:after="60"/>
-      </w:pPr>
-      <w:r>
-        <w:t xml:space="preserve">Opens </w:t>
-      </w:r>
-      <w:r>
-        <w:rPr>
-          <w:b/>
-          <w:bCs/>
-        </w:rPr>
-        <w:t xml:space="preserve">Assignments</w:t>
-      </w:r>
-      <w:r>
-        <w:t xml:space="preserve">, pastes a link and clicks </w:t>
-      </w:r>
-      <w:r>
-        <w:rPr>
-          <w:b/>
-          <w:bCs/>
-        </w:rPr>
-        <w:t xml:space="preserve">Submit</w:t>
-      </w:r>
-      <w:r>
-        <w:t xml:space="preserve"> (can re-submit).</w:t>
-      </w:r>
-    </w:p>
-    <w:p>
-      <w:pPr>
-        <w:pStyle w:val="ListParagraph"/>
-        <w:numPr>
-          <w:ilvl w:val="0"/>
-          <w:numId w:val="11"/>
-        </w:numPr>
-        <w:spacing w:after="60"/>
-      </w:pPr>
-      <w:r>
-        <w:t xml:space="preserve">Checks </w:t>
-      </w:r>
-      <w:r>
-        <w:rPr>
-          <w:b/>
-          <w:bCs/>
-        </w:rPr>
-        <w:t xml:space="preserve">Results</w:t>
-      </w:r>
-      <w:r>
-        <w:t xml:space="preserve">, </w:t>
-      </w:r>
-      <w:r>
-        <w:rPr>
-          <w:b/>
-          <w:bCs/>
-        </w:rPr>
-        <w:t xml:space="preserve">Notices</w:t>
-      </w:r>
-      <w:r>
-        <w:t xml:space="preserve"> and </w:t>
-      </w:r>
-      <w:r>
-        <w:rPr>
-          <w:b/>
-          <w:bCs/>
-        </w:rPr>
-        <w:t xml:space="preserve">Events</w:t>
-      </w:r>
-      <w:r>
-        <w:t xml:space="preserve">.</w:t>
-      </w:r>
-    </w:p>
-    <w:p>
-      <w:pPr>
-        <w:pStyle w:val="ListParagraph"/>
-        <w:numPr>
-          <w:ilvl w:val="0"/>
-          <w:numId w:val="11"/>
-        </w:numPr>
-        <w:spacing w:after="60"/>
-      </w:pPr>
-      <w:r>
-        <w:t xml:space="preserve">Raises a </w:t>
-      </w:r>
-      <w:r>
-        <w:rPr>
-          <w:b/>
-          <w:bCs/>
-        </w:rPr>
-        <w:t xml:space="preserve">Complaint</w:t>
-      </w:r>
-      <w:r>
-        <w:t xml:space="preserve"> and watches its status change.</w:t>
-      </w:r>
-    </w:p>
-    <w:p>
-      <w:pPr>
-        <w:pStyle w:val="ListParagraph"/>
-        <w:numPr>
-          <w:ilvl w:val="0"/>
-          <w:numId w:val="11"/>
-        </w:numPr>
-        <w:spacing w:after="60"/>
-      </w:pPr>
-      <w:r>
-        <w:t xml:space="preserve">Applies for </w:t>
-      </w:r>
-      <w:r>
-        <w:rPr>
-          <w:b/>
-          <w:bCs/>
-        </w:rPr>
-        <w:t xml:space="preserve">Leave</w:t>
-      </w:r>
-      <w:r>
-        <w:t xml:space="preserve"> and sees whether it is pending, approved or rejected.</w:t>
+        <w:t xml:space="preserve">Figure 25: Faculty — marking attendance (one student absent)</w:t>
       </w:r>
     </w:p>
     <w:p>
@@ -44626,9 +45364,9 @@
       <w:r>
         <w:drawing>
           <wp:inline distT="0" distB="0" distL="0" distR="0">
-            <wp:extent cx="5715000" cy="1609725"/>
+            <wp:extent cx="5715000" cy="2400300"/>
             <wp:effectExtent t="0" r="0" b="0" l="0"/>
-            <wp:docPr id="1" name="11-student-attendance.png" descr="Student (Aarav) — good attendance" title="Student (Aarav) — good attendance"/>
+            <wp:docPr id="1" name="22-faculty-assignments.png" descr="Faculty — assignment with a student's submission" title="Faculty — assignment with a student's submission"/>
             <wp:cNvGraphicFramePr>
               <a:graphicFrameLocks xmlns:a="http://schemas.openxmlformats.org/drawingml/2006/main" noChangeAspect="1"/>
             </wp:cNvGraphicFramePr>
@@ -44651,6 +45389,285 @@
                   <pic:spPr bwMode="auto">
                     <a:xfrm>
                       <a:off x="0" y="0"/>
+                      <a:ext cx="5715000" cy="2400300"/>
+                    </a:xfrm>
+                    <a:prstGeom prst="rect">
+                      <a:avLst/>
+                    </a:prstGeom>
+                  </pic:spPr>
+                </pic:pic>
+              </a:graphicData>
+            </a:graphic>
+          </wp:inline>
+        </w:drawing>
+      </w:r>
+    </w:p>
+    <w:p>
+      <w:pPr>
+        <w:spacing w:after="220"/>
+        <w:jc w:val="center"/>
+      </w:pPr>
+      <w:r>
+        <w:rPr>
+          <w:i/>
+          <w:iCs/>
+          <w:color w:val="404040"/>
+          <w:sz w:val="18"/>
+          <w:szCs w:val="18"/>
+        </w:rPr>
+        <w:t xml:space="preserve">Figure 26: Faculty — assignment with a student's submission</w:t>
+      </w:r>
+    </w:p>
+    <w:p>
+      <w:pPr>
+        <w:keepNext/>
+        <w:spacing w:after="60" w:before="120"/>
+        <w:jc w:val="center"/>
+      </w:pPr>
+      <w:r>
+        <w:drawing>
+          <wp:inline distT="0" distB="0" distL="0" distR="0">
+            <wp:extent cx="5715000" cy="3743325"/>
+            <wp:effectExtent t="0" r="0" b="0" l="0"/>
+            <wp:docPr id="1" name="23-faculty-results.png" descr="Faculty — entering marks" title="Faculty — entering marks"/>
+            <wp:cNvGraphicFramePr>
+              <a:graphicFrameLocks xmlns:a="http://schemas.openxmlformats.org/drawingml/2006/main" noChangeAspect="1"/>
+            </wp:cNvGraphicFramePr>
+            <a:graphic xmlns:a="http://schemas.openxmlformats.org/drawingml/2006/main">
+              <a:graphicData uri="http://schemas.openxmlformats.org/drawingml/2006/picture">
+                <pic:pic xmlns:pic="http://schemas.openxmlformats.org/drawingml/2006/picture">
+                  <pic:nvPicPr>
+                    <pic:cNvPr id="0" name="" descr=""/>
+                    <pic:cNvPicPr>
+                      <a:picLocks noChangeAspect="1" noChangeArrowheads="1"/>
+                    </pic:cNvPicPr>
+                  </pic:nvPicPr>
+                  <pic:blipFill>
+                    <a:blip r:embed="rId36" cstate="none"/>
+                    <a:srcRect/>
+                    <a:stretch>
+                      <a:fillRect/>
+                    </a:stretch>
+                  </pic:blipFill>
+                  <pic:spPr bwMode="auto">
+                    <a:xfrm>
+                      <a:off x="0" y="0"/>
+                      <a:ext cx="5715000" cy="3743325"/>
+                    </a:xfrm>
+                    <a:prstGeom prst="rect">
+                      <a:avLst/>
+                    </a:prstGeom>
+                  </pic:spPr>
+                </pic:pic>
+              </a:graphicData>
+            </a:graphic>
+          </wp:inline>
+        </w:drawing>
+      </w:r>
+    </w:p>
+    <w:p>
+      <w:pPr>
+        <w:spacing w:after="220"/>
+        <w:jc w:val="center"/>
+      </w:pPr>
+      <w:r>
+        <w:rPr>
+          <w:i/>
+          <w:iCs/>
+          <w:color w:val="404040"/>
+          <w:sz w:val="18"/>
+          <w:szCs w:val="18"/>
+        </w:rPr>
+        <w:t xml:space="preserve">Figure 27: Faculty — entering marks</w:t>
+      </w:r>
+    </w:p>
+    <w:p>
+      <w:pPr>
+        <w:pStyle w:val="Heading2"/>
+      </w:pPr>
+      <w:r>
+        <w:t xml:space="preserve">12.5 Student Flow</w:t>
+      </w:r>
+    </w:p>
+    <w:p>
+      <w:pPr>
+        <w:pStyle w:val="ListParagraph"/>
+        <w:numPr>
+          <w:ilvl w:val="0"/>
+          <w:numId w:val="12"/>
+        </w:numPr>
+        <w:spacing w:after="60"/>
+      </w:pPr>
+      <w:r>
+        <w:t xml:space="preserve">Student logs in to </w:t>
+      </w:r>
+      <w:r>
+        <w:rPr>
+          <w:b/>
+          <w:bCs/>
+        </w:rPr>
+        <w:t xml:space="preserve">My Attendance</w:t>
+      </w:r>
+      <w:r>
+        <w:t xml:space="preserve"> — percentage per course, red if below 75%.</w:t>
+      </w:r>
+    </w:p>
+    <w:p>
+      <w:pPr>
+        <w:pStyle w:val="ListParagraph"/>
+        <w:numPr>
+          <w:ilvl w:val="0"/>
+          <w:numId w:val="12"/>
+        </w:numPr>
+        <w:spacing w:after="60"/>
+      </w:pPr>
+      <w:r>
+        <w:t xml:space="preserve">Opens </w:t>
+      </w:r>
+      <w:r>
+        <w:rPr>
+          <w:b/>
+          <w:bCs/>
+        </w:rPr>
+        <w:t xml:space="preserve">Assignments</w:t>
+      </w:r>
+      <w:r>
+        <w:t xml:space="preserve">, pastes a link and clicks </w:t>
+      </w:r>
+      <w:r>
+        <w:rPr>
+          <w:b/>
+          <w:bCs/>
+        </w:rPr>
+        <w:t xml:space="preserve">Submit</w:t>
+      </w:r>
+      <w:r>
+        <w:t xml:space="preserve"> (can re-submit).</w:t>
+      </w:r>
+    </w:p>
+    <w:p>
+      <w:pPr>
+        <w:pStyle w:val="ListParagraph"/>
+        <w:numPr>
+          <w:ilvl w:val="0"/>
+          <w:numId w:val="12"/>
+        </w:numPr>
+        <w:spacing w:after="60"/>
+      </w:pPr>
+      <w:r>
+        <w:t xml:space="preserve">Checks </w:t>
+      </w:r>
+      <w:r>
+        <w:rPr>
+          <w:b/>
+          <w:bCs/>
+        </w:rPr>
+        <w:t xml:space="preserve">Results</w:t>
+      </w:r>
+      <w:r>
+        <w:t xml:space="preserve">, </w:t>
+      </w:r>
+      <w:r>
+        <w:rPr>
+          <w:b/>
+          <w:bCs/>
+        </w:rPr>
+        <w:t xml:space="preserve">Notices</w:t>
+      </w:r>
+      <w:r>
+        <w:t xml:space="preserve"> and </w:t>
+      </w:r>
+      <w:r>
+        <w:rPr>
+          <w:b/>
+          <w:bCs/>
+        </w:rPr>
+        <w:t xml:space="preserve">Events</w:t>
+      </w:r>
+      <w:r>
+        <w:t xml:space="preserve">.</w:t>
+      </w:r>
+    </w:p>
+    <w:p>
+      <w:pPr>
+        <w:pStyle w:val="ListParagraph"/>
+        <w:numPr>
+          <w:ilvl w:val="0"/>
+          <w:numId w:val="12"/>
+        </w:numPr>
+        <w:spacing w:after="60"/>
+      </w:pPr>
+      <w:r>
+        <w:t xml:space="preserve">Raises a </w:t>
+      </w:r>
+      <w:r>
+        <w:rPr>
+          <w:b/>
+          <w:bCs/>
+        </w:rPr>
+        <w:t xml:space="preserve">Complaint</w:t>
+      </w:r>
+      <w:r>
+        <w:t xml:space="preserve"> and watches its status change.</w:t>
+      </w:r>
+    </w:p>
+    <w:p>
+      <w:pPr>
+        <w:pStyle w:val="ListParagraph"/>
+        <w:numPr>
+          <w:ilvl w:val="0"/>
+          <w:numId w:val="12"/>
+        </w:numPr>
+        <w:spacing w:after="60"/>
+      </w:pPr>
+      <w:r>
+        <w:t xml:space="preserve">Applies for </w:t>
+      </w:r>
+      <w:r>
+        <w:rPr>
+          <w:b/>
+          <w:bCs/>
+        </w:rPr>
+        <w:t xml:space="preserve">Leave</w:t>
+      </w:r>
+      <w:r>
+        <w:t xml:space="preserve"> and sees whether it is pending, approved or rejected.</w:t>
+      </w:r>
+    </w:p>
+    <w:p>
+      <w:pPr>
+        <w:keepNext/>
+        <w:spacing w:after="60" w:before="120"/>
+        <w:jc w:val="center"/>
+      </w:pPr>
+      <w:r>
+        <w:drawing>
+          <wp:inline distT="0" distB="0" distL="0" distR="0">
+            <wp:extent cx="5715000" cy="1609725"/>
+            <wp:effectExtent t="0" r="0" b="0" l="0"/>
+            <wp:docPr id="1" name="11-student-attendance.png" descr="Student (Aarav) — good attendance" title="Student (Aarav) — good attendance"/>
+            <wp:cNvGraphicFramePr>
+              <a:graphicFrameLocks xmlns:a="http://schemas.openxmlformats.org/drawingml/2006/main" noChangeAspect="1"/>
+            </wp:cNvGraphicFramePr>
+            <a:graphic xmlns:a="http://schemas.openxmlformats.org/drawingml/2006/main">
+              <a:graphicData uri="http://schemas.openxmlformats.org/drawingml/2006/picture">
+                <pic:pic xmlns:pic="http://schemas.openxmlformats.org/drawingml/2006/picture">
+                  <pic:nvPicPr>
+                    <pic:cNvPr id="0" name="" descr=""/>
+                    <pic:cNvPicPr>
+                      <a:picLocks noChangeAspect="1" noChangeArrowheads="1"/>
+                    </pic:cNvPicPr>
+                  </pic:nvPicPr>
+                  <pic:blipFill>
+                    <a:blip r:embed="rId37" cstate="none"/>
+                    <a:srcRect/>
+                    <a:stretch>
+                      <a:fillRect/>
+                    </a:stretch>
+                  </pic:blipFill>
+                  <pic:spPr bwMode="auto">
+                    <a:xfrm>
+                      <a:off x="0" y="0"/>
                       <a:ext cx="5715000" cy="1609725"/>
                     </a:xfrm>
                     <a:prstGeom prst="rect">
@@ -44677,7 +45694,7 @@
           <w:sz w:val="18"/>
           <w:szCs w:val="18"/>
         </w:rPr>
-        <w:t xml:space="preserve">Figure 26: Student (Aarav) — good attendance</w:t>
+        <w:t xml:space="preserve">Figure 28: Student (Aarav) — good attendance</w:t>
       </w:r>
     </w:p>
     <w:p>
@@ -44740,7 +45757,7 @@
           <w:sz w:val="18"/>
           <w:szCs w:val="18"/>
         </w:rPr>
-        <w:t xml:space="preserve">Figure 27: Student (Kabir) — below 75%, shown in red</w:t>
+        <w:t xml:space="preserve">Figure 29: Student (Kabir) — below 75%, shown in red</w:t>
       </w:r>
     </w:p>
     <w:p>
@@ -44755,132 +45772,6 @@
             <wp:extent cx="5715000" cy="1809750"/>
             <wp:effectExtent t="0" r="0" b="0" l="0"/>
             <wp:docPr id="1" name="12-student-assignments.png" descr="Student — assignment submitted" title="Student — assignment submitted"/>
-            <wp:cNvGraphicFramePr>
-              <a:graphicFrameLocks xmlns:a="http://schemas.openxmlformats.org/drawingml/2006/main" noChangeAspect="1"/>
-            </wp:cNvGraphicFramePr>
-            <a:graphic xmlns:a="http://schemas.openxmlformats.org/drawingml/2006/main">
-              <a:graphicData uri="http://schemas.openxmlformats.org/drawingml/2006/picture">
-                <pic:pic xmlns:pic="http://schemas.openxmlformats.org/drawingml/2006/picture">
-                  <pic:nvPicPr>
-                    <pic:cNvPr id="0" name="" descr=""/>
-                    <pic:cNvPicPr>
-                      <a:picLocks noChangeAspect="1" noChangeArrowheads="1"/>
-                    </pic:cNvPicPr>
-                  </pic:nvPicPr>
-                  <pic:blipFill>
-                    <a:blip r:embed="rId36" cstate="none"/>
-                    <a:srcRect/>
-                    <a:stretch>
-                      <a:fillRect/>
-                    </a:stretch>
-                  </pic:blipFill>
-                  <pic:spPr bwMode="auto">
-                    <a:xfrm>
-                      <a:off x="0" y="0"/>
-                      <a:ext cx="5715000" cy="1809750"/>
-                    </a:xfrm>
-                    <a:prstGeom prst="rect">
-                      <a:avLst/>
-                    </a:prstGeom>
-                  </pic:spPr>
-                </pic:pic>
-              </a:graphicData>
-            </a:graphic>
-          </wp:inline>
-        </w:drawing>
-      </w:r>
-    </w:p>
-    <w:p>
-      <w:pPr>
-        <w:spacing w:after="220"/>
-        <w:jc w:val="center"/>
-      </w:pPr>
-      <w:r>
-        <w:rPr>
-          <w:i/>
-          <w:iCs/>
-          <w:color w:val="404040"/>
-          <w:sz w:val="18"/>
-          <w:szCs w:val="18"/>
-        </w:rPr>
-        <w:t xml:space="preserve">Figure 28: Student — assignment submitted</w:t>
-      </w:r>
-    </w:p>
-    <w:p>
-      <w:pPr>
-        <w:keepNext/>
-        <w:spacing w:after="60" w:before="120"/>
-        <w:jc w:val="center"/>
-      </w:pPr>
-      <w:r>
-        <w:drawing>
-          <wp:inline distT="0" distB="0" distL="0" distR="0">
-            <wp:extent cx="5715000" cy="1457325"/>
-            <wp:effectExtent t="0" r="0" b="0" l="0"/>
-            <wp:docPr id="1" name="13-student-results.png" descr="Student — sees only their own marks" title="Student — sees only their own marks"/>
-            <wp:cNvGraphicFramePr>
-              <a:graphicFrameLocks xmlns:a="http://schemas.openxmlformats.org/drawingml/2006/main" noChangeAspect="1"/>
-            </wp:cNvGraphicFramePr>
-            <a:graphic xmlns:a="http://schemas.openxmlformats.org/drawingml/2006/main">
-              <a:graphicData uri="http://schemas.openxmlformats.org/drawingml/2006/picture">
-                <pic:pic xmlns:pic="http://schemas.openxmlformats.org/drawingml/2006/picture">
-                  <pic:nvPicPr>
-                    <pic:cNvPr id="0" name="" descr=""/>
-                    <pic:cNvPicPr>
-                      <a:picLocks noChangeAspect="1" noChangeArrowheads="1"/>
-                    </pic:cNvPicPr>
-                  </pic:nvPicPr>
-                  <pic:blipFill>
-                    <a:blip r:embed="rId37" cstate="none"/>
-                    <a:srcRect/>
-                    <a:stretch>
-                      <a:fillRect/>
-                    </a:stretch>
-                  </pic:blipFill>
-                  <pic:spPr bwMode="auto">
-                    <a:xfrm>
-                      <a:off x="0" y="0"/>
-                      <a:ext cx="5715000" cy="1457325"/>
-                    </a:xfrm>
-                    <a:prstGeom prst="rect">
-                      <a:avLst/>
-                    </a:prstGeom>
-                  </pic:spPr>
-                </pic:pic>
-              </a:graphicData>
-            </a:graphic>
-          </wp:inline>
-        </w:drawing>
-      </w:r>
-    </w:p>
-    <w:p>
-      <w:pPr>
-        <w:spacing w:after="220"/>
-        <w:jc w:val="center"/>
-      </w:pPr>
-      <w:r>
-        <w:rPr>
-          <w:i/>
-          <w:iCs/>
-          <w:color w:val="404040"/>
-          <w:sz w:val="18"/>
-          <w:szCs w:val="18"/>
-        </w:rPr>
-        <w:t xml:space="preserve">Figure 29: Student — sees only their own marks</w:t>
-      </w:r>
-    </w:p>
-    <w:p>
-      <w:pPr>
-        <w:keepNext/>
-        <w:spacing w:after="60" w:before="120"/>
-        <w:jc w:val="center"/>
-      </w:pPr>
-      <w:r>
-        <w:drawing>
-          <wp:inline distT="0" distB="0" distL="0" distR="0">
-            <wp:extent cx="5715000" cy="2057400"/>
-            <wp:effectExtent t="0" r="0" b="0" l="0"/>
-            <wp:docPr id="1" name="14-notices.png" descr="Student — notices (college-wide + own department)" title="Student — notices (college-wide + own department)"/>
             <wp:cNvGraphicFramePr>
               <a:graphicFrameLocks xmlns:a="http://schemas.openxmlformats.org/drawingml/2006/main" noChangeAspect="1"/>
             </wp:cNvGraphicFramePr>
@@ -44903,7 +45794,7 @@
                   <pic:spPr bwMode="auto">
                     <a:xfrm>
                       <a:off x="0" y="0"/>
-                      <a:ext cx="5715000" cy="2057400"/>
+                      <a:ext cx="5715000" cy="1809750"/>
                     </a:xfrm>
                     <a:prstGeom prst="rect">
                       <a:avLst/>
@@ -44929,7 +45820,7 @@
           <w:sz w:val="18"/>
           <w:szCs w:val="18"/>
         </w:rPr>
-        <w:t xml:space="preserve">Figure 30: Student — notices (college-wide + own department)</w:t>
+        <w:t xml:space="preserve">Figure 30: Student — assignment submitted</w:t>
       </w:r>
     </w:p>
     <w:p>
@@ -44941,9 +45832,9 @@
       <w:r>
         <w:drawing>
           <wp:inline distT="0" distB="0" distL="0" distR="0">
-            <wp:extent cx="5715000" cy="1543050"/>
+            <wp:extent cx="5715000" cy="1457325"/>
             <wp:effectExtent t="0" r="0" b="0" l="0"/>
-            <wp:docPr id="1" name="15-events.png" descr="Student — upcoming events" title="Student — upcoming events"/>
+            <wp:docPr id="1" name="13-student-results.png" descr="Student — sees only their own marks" title="Student — sees only their own marks"/>
             <wp:cNvGraphicFramePr>
               <a:graphicFrameLocks xmlns:a="http://schemas.openxmlformats.org/drawingml/2006/main" noChangeAspect="1"/>
             </wp:cNvGraphicFramePr>
@@ -44966,7 +45857,7 @@
                   <pic:spPr bwMode="auto">
                     <a:xfrm>
                       <a:off x="0" y="0"/>
-                      <a:ext cx="5715000" cy="1543050"/>
+                      <a:ext cx="5715000" cy="1457325"/>
                     </a:xfrm>
                     <a:prstGeom prst="rect">
                       <a:avLst/>
@@ -44992,7 +45883,7 @@
           <w:sz w:val="18"/>
           <w:szCs w:val="18"/>
         </w:rPr>
-        <w:t xml:space="preserve">Figure 31: Student — upcoming events</w:t>
+        <w:t xml:space="preserve">Figure 31: Student — sees only their own marks</w:t>
       </w:r>
     </w:p>
     <w:p>
@@ -45004,9 +45895,9 @@
       <w:r>
         <w:drawing>
           <wp:inline distT="0" distB="0" distL="0" distR="0">
-            <wp:extent cx="5715000" cy="2295525"/>
+            <wp:extent cx="5715000" cy="2057400"/>
             <wp:effectExtent t="0" r="0" b="0" l="0"/>
-            <wp:docPr id="1" name="16-student-complaints.png" descr="Student — raising and tracking complaints" title="Student — raising and tracking complaints"/>
+            <wp:docPr id="1" name="14-notices.png" descr="Student — notices (college-wide + own department)" title="Student — notices (college-wide + own department)"/>
             <wp:cNvGraphicFramePr>
               <a:graphicFrameLocks xmlns:a="http://schemas.openxmlformats.org/drawingml/2006/main" noChangeAspect="1"/>
             </wp:cNvGraphicFramePr>
@@ -45029,7 +45920,7 @@
                   <pic:spPr bwMode="auto">
                     <a:xfrm>
                       <a:off x="0" y="0"/>
-                      <a:ext cx="5715000" cy="2295525"/>
+                      <a:ext cx="5715000" cy="2057400"/>
                     </a:xfrm>
                     <a:prstGeom prst="rect">
                       <a:avLst/>
@@ -45055,7 +45946,7 @@
           <w:sz w:val="18"/>
           <w:szCs w:val="18"/>
         </w:rPr>
-        <w:t xml:space="preserve">Figure 32: Student — raising and tracking complaints</w:t>
+        <w:t xml:space="preserve">Figure 32: Student — notices (college-wide + own department)</w:t>
       </w:r>
     </w:p>
     <w:p>
@@ -45067,9 +45958,9 @@
       <w:r>
         <w:drawing>
           <wp:inline distT="0" distB="0" distL="0" distR="0">
-            <wp:extent cx="5715000" cy="2133600"/>
+            <wp:extent cx="5715000" cy="1543050"/>
             <wp:effectExtent t="0" r="0" b="0" l="0"/>
-            <wp:docPr id="1" name="17-student-leaves.png" descr="Student — leave requests and their status" title="Student — leave requests and their status"/>
+            <wp:docPr id="1" name="15-events.png" descr="Student — upcoming events" title="Student — upcoming events"/>
             <wp:cNvGraphicFramePr>
               <a:graphicFrameLocks xmlns:a="http://schemas.openxmlformats.org/drawingml/2006/main" noChangeAspect="1"/>
             </wp:cNvGraphicFramePr>
@@ -45092,6 +45983,132 @@
                   <pic:spPr bwMode="auto">
                     <a:xfrm>
                       <a:off x="0" y="0"/>
+                      <a:ext cx="5715000" cy="1543050"/>
+                    </a:xfrm>
+                    <a:prstGeom prst="rect">
+                      <a:avLst/>
+                    </a:prstGeom>
+                  </pic:spPr>
+                </pic:pic>
+              </a:graphicData>
+            </a:graphic>
+          </wp:inline>
+        </w:drawing>
+      </w:r>
+    </w:p>
+    <w:p>
+      <w:pPr>
+        <w:spacing w:after="220"/>
+        <w:jc w:val="center"/>
+      </w:pPr>
+      <w:r>
+        <w:rPr>
+          <w:i/>
+          <w:iCs/>
+          <w:color w:val="404040"/>
+          <w:sz w:val="18"/>
+          <w:szCs w:val="18"/>
+        </w:rPr>
+        <w:t xml:space="preserve">Figure 33: Student — upcoming events</w:t>
+      </w:r>
+    </w:p>
+    <w:p>
+      <w:pPr>
+        <w:keepNext/>
+        <w:spacing w:after="60" w:before="120"/>
+        <w:jc w:val="center"/>
+      </w:pPr>
+      <w:r>
+        <w:drawing>
+          <wp:inline distT="0" distB="0" distL="0" distR="0">
+            <wp:extent cx="5715000" cy="2295525"/>
+            <wp:effectExtent t="0" r="0" b="0" l="0"/>
+            <wp:docPr id="1" name="16-student-complaints.png" descr="Student — raising and tracking complaints" title="Student — raising and tracking complaints"/>
+            <wp:cNvGraphicFramePr>
+              <a:graphicFrameLocks xmlns:a="http://schemas.openxmlformats.org/drawingml/2006/main" noChangeAspect="1"/>
+            </wp:cNvGraphicFramePr>
+            <a:graphic xmlns:a="http://schemas.openxmlformats.org/drawingml/2006/main">
+              <a:graphicData uri="http://schemas.openxmlformats.org/drawingml/2006/picture">
+                <pic:pic xmlns:pic="http://schemas.openxmlformats.org/drawingml/2006/picture">
+                  <pic:nvPicPr>
+                    <pic:cNvPr id="0" name="" descr=""/>
+                    <pic:cNvPicPr>
+                      <a:picLocks noChangeAspect="1" noChangeArrowheads="1"/>
+                    </pic:cNvPicPr>
+                  </pic:nvPicPr>
+                  <pic:blipFill>
+                    <a:blip r:embed="rId42" cstate="none"/>
+                    <a:srcRect/>
+                    <a:stretch>
+                      <a:fillRect/>
+                    </a:stretch>
+                  </pic:blipFill>
+                  <pic:spPr bwMode="auto">
+                    <a:xfrm>
+                      <a:off x="0" y="0"/>
+                      <a:ext cx="5715000" cy="2295525"/>
+                    </a:xfrm>
+                    <a:prstGeom prst="rect">
+                      <a:avLst/>
+                    </a:prstGeom>
+                  </pic:spPr>
+                </pic:pic>
+              </a:graphicData>
+            </a:graphic>
+          </wp:inline>
+        </w:drawing>
+      </w:r>
+    </w:p>
+    <w:p>
+      <w:pPr>
+        <w:spacing w:after="220"/>
+        <w:jc w:val="center"/>
+      </w:pPr>
+      <w:r>
+        <w:rPr>
+          <w:i/>
+          <w:iCs/>
+          <w:color w:val="404040"/>
+          <w:sz w:val="18"/>
+          <w:szCs w:val="18"/>
+        </w:rPr>
+        <w:t xml:space="preserve">Figure 34: Student — raising and tracking complaints</w:t>
+      </w:r>
+    </w:p>
+    <w:p>
+      <w:pPr>
+        <w:keepNext/>
+        <w:spacing w:after="60" w:before="120"/>
+        <w:jc w:val="center"/>
+      </w:pPr>
+      <w:r>
+        <w:drawing>
+          <wp:inline distT="0" distB="0" distL="0" distR="0">
+            <wp:extent cx="5715000" cy="2133600"/>
+            <wp:effectExtent t="0" r="0" b="0" l="0"/>
+            <wp:docPr id="1" name="17-student-leaves.png" descr="Student — leave requests and their status" title="Student — leave requests and their status"/>
+            <wp:cNvGraphicFramePr>
+              <a:graphicFrameLocks xmlns:a="http://schemas.openxmlformats.org/drawingml/2006/main" noChangeAspect="1"/>
+            </wp:cNvGraphicFramePr>
+            <a:graphic xmlns:a="http://schemas.openxmlformats.org/drawingml/2006/main">
+              <a:graphicData uri="http://schemas.openxmlformats.org/drawingml/2006/picture">
+                <pic:pic xmlns:pic="http://schemas.openxmlformats.org/drawingml/2006/picture">
+                  <pic:nvPicPr>
+                    <pic:cNvPr id="0" name="" descr=""/>
+                    <pic:cNvPicPr>
+                      <a:picLocks noChangeAspect="1" noChangeArrowheads="1"/>
+                    </pic:cNvPicPr>
+                  </pic:nvPicPr>
+                  <pic:blipFill>
+                    <a:blip r:embed="rId43" cstate="none"/>
+                    <a:srcRect/>
+                    <a:stretch>
+                      <a:fillRect/>
+                    </a:stretch>
+                  </pic:blipFill>
+                  <pic:spPr bwMode="auto">
+                    <a:xfrm>
+                      <a:off x="0" y="0"/>
                       <a:ext cx="5715000" cy="2133600"/>
                     </a:xfrm>
                     <a:prstGeom prst="rect">
@@ -45118,7 +46135,7 @@
           <w:sz w:val="18"/>
           <w:szCs w:val="18"/>
         </w:rPr>
-        <w:t xml:space="preserve">Figure 33: Student — leave requests and their status</w:t>
+        <w:t xml:space="preserve">Figure 35: Student — leave requests and their status</w:t>
       </w:r>
     </w:p>
     <w:p>
@@ -45134,7 +46151,7 @@
         <w:pStyle w:val="ListParagraph"/>
         <w:numPr>
           <w:ilvl w:val="0"/>
-          <w:numId w:val="12"/>
+          <w:numId w:val="13"/>
         </w:numPr>
         <w:spacing w:after="60"/>
       </w:pPr>
@@ -45154,7 +46171,7 @@
         <w:pStyle w:val="ListParagraph"/>
         <w:numPr>
           <w:ilvl w:val="0"/>
-          <w:numId w:val="12"/>
+          <w:numId w:val="13"/>
         </w:numPr>
         <w:spacing w:after="60"/>
       </w:pPr>
@@ -45174,7 +46191,7 @@
         <w:pStyle w:val="ListParagraph"/>
         <w:numPr>
           <w:ilvl w:val="0"/>
-          <w:numId w:val="12"/>
+          <w:numId w:val="13"/>
         </w:numPr>
         <w:spacing w:after="60"/>
       </w:pPr>
@@ -45204,7 +46221,7 @@
         <w:pStyle w:val="ListParagraph"/>
         <w:numPr>
           <w:ilvl w:val="0"/>
-          <w:numId w:val="12"/>
+          <w:numId w:val="13"/>
         </w:numPr>
         <w:spacing w:after="60"/>
       </w:pPr>
@@ -45234,7 +46251,7 @@
         <w:pStyle w:val="ListParagraph"/>
         <w:numPr>
           <w:ilvl w:val="0"/>
-          <w:numId w:val="12"/>
+          <w:numId w:val="13"/>
         </w:numPr>
         <w:spacing w:after="60"/>
       </w:pPr>
@@ -45264,7 +46281,7 @@
         <w:pStyle w:val="ListParagraph"/>
         <w:numPr>
           <w:ilvl w:val="0"/>
-          <w:numId w:val="12"/>
+          <w:numId w:val="13"/>
         </w:numPr>
         <w:spacing w:after="60"/>
       </w:pPr>
@@ -48093,7 +49110,7 @@
           <w:sz w:val="18"/>
           <w:szCs w:val="18"/>
         </w:rPr>
-        <w:t xml:space="preserve">Table 26: Permission matrix (enforced on the server by allowRoles and filters)</w:t>
+        <w:t xml:space="preserve">Table 27: Permission matrix (enforced on the server by allowRoles and filters)</w:t>
       </w:r>
     </w:p>
     <w:p>
@@ -51675,7 +52692,7 @@
                 <w:sz w:val="19"/>
                 <w:szCs w:val="19"/>
               </w:rPr>
-              <w:t xml:space="preserve">API docs page</w:t>
+              <w:t xml:space="preserve">Swagger UI</w:t>
             </w:r>
           </w:p>
         </w:tc>
@@ -51707,7 +52724,7 @@
                 <w:sz w:val="19"/>
                 <w:szCs w:val="19"/>
               </w:rPr>
-              <w:t xml:space="preserve">open http://localhost:8000 without a token</w:t>
+              <w:t xml:space="preserve">open /api-docs, login, Authorize, Try it out on GET /courses</w:t>
             </w:r>
           </w:p>
         </w:tc>
@@ -51739,7 +52756,7 @@
                 <w:sz w:val="19"/>
                 <w:szCs w:val="19"/>
               </w:rPr>
-              <w:t xml:space="preserve">Docs page with all 28 endpoints</w:t>
+              <w:t xml:space="preserve">Docs load without token; GET /courses returns 200 with data</w:t>
             </w:r>
           </w:p>
         </w:tc>
@@ -52114,7 +53131,7 @@
           <w:sz w:val="18"/>
           <w:szCs w:val="18"/>
         </w:rPr>
-        <w:t xml:space="preserve">Table 27: Test cases</w:t>
+        <w:t xml:space="preserve">Table 28: Test cases</w:t>
       </w:r>
     </w:p>
     <w:p>
@@ -52373,7 +53390,7 @@
                 <w:sz w:val="19"/>
                 <w:szCs w:val="19"/>
               </w:rPr>
-              <w:t xml:space="preserve">Member 1 – [Name] (Team lead)</w:t>
+              <w:t xml:space="preserve">Neel (Team lead)</w:t>
             </w:r>
           </w:p>
         </w:tc>
@@ -52437,7 +53454,7 @@
                 <w:sz w:val="19"/>
                 <w:szCs w:val="19"/>
               </w:rPr>
-              <w:t xml:space="preserve">server.js, config/db.js, middleware/authMiddleware.js, middleware/roleMiddleware.js, utils/password.js, utils/apiDocs.js, models/User.js, routes/authRoutes.js, routes/userRoutes.js</w:t>
+              <w:t xml:space="preserve">server.js, config/db.js, middleware/authMiddleware.js, middleware/roleMiddleware.js, utils/password.js, swagger.json, models/User.js, routes/authRoutes.js, routes/userRoutes.js</w:t>
             </w:r>
           </w:p>
         </w:tc>
@@ -52501,7 +53518,7 @@
                 <w:sz w:val="19"/>
                 <w:szCs w:val="19"/>
               </w:rPr>
-              <w:t xml:space="preserve">Folder structure, JWT + password hashing, role rules, API docs page, merging code</w:t>
+              <w:t xml:space="preserve">Folder structure, JWT + password hashing, role rules, Swagger docs, merging code</w:t>
             </w:r>
           </w:p>
         </w:tc>
@@ -52535,7 +53552,7 @@
                 <w:sz w:val="19"/>
                 <w:szCs w:val="19"/>
               </w:rPr>
-              <w:t xml:space="preserve">Member 2 – [Name]</w:t>
+              <w:t xml:space="preserve">Nimish</w:t>
             </w:r>
           </w:p>
         </w:tc>
@@ -52697,7 +53714,7 @@
                 <w:sz w:val="19"/>
                 <w:szCs w:val="19"/>
               </w:rPr>
-              <w:t xml:space="preserve">Member 3 – [Name]</w:t>
+              <w:t xml:space="preserve">Swanandi</w:t>
             </w:r>
           </w:p>
         </w:tc>
@@ -52859,7 +53876,7 @@
                 <w:sz w:val="19"/>
                 <w:szCs w:val="19"/>
               </w:rPr>
-              <w:t xml:space="preserve">Member 4 – [Name]</w:t>
+              <w:t xml:space="preserve">Akshay</w:t>
             </w:r>
           </w:p>
         </w:tc>
@@ -53021,7 +54038,7 @@
                 <w:sz w:val="19"/>
                 <w:szCs w:val="19"/>
               </w:rPr>
-              <w:t xml:space="preserve">Member 5 – [Name]</w:t>
+              <w:t xml:space="preserve">Sneha</w:t>
             </w:r>
           </w:p>
         </w:tc>
@@ -53168,7 +54185,7 @@
           <w:sz w:val="18"/>
           <w:szCs w:val="18"/>
         </w:rPr>
-        <w:t xml:space="preserve">Table 28: Who built what</w:t>
+        <w:t xml:space="preserve">Table 29: Who built what</w:t>
       </w:r>
     </w:p>
     <w:p>
@@ -53201,7 +54218,7 @@
         <w:pStyle w:val="ListParagraph"/>
         <w:numPr>
           <w:ilvl w:val="0"/>
-          <w:numId w:val="13"/>
+          <w:numId w:val="14"/>
         </w:numPr>
         <w:spacing w:after="60"/>
       </w:pPr>
@@ -53234,7 +54251,7 @@
         <w:pStyle w:val="ListParagraph"/>
         <w:numPr>
           <w:ilvl w:val="0"/>
-          <w:numId w:val="13"/>
+          <w:numId w:val="14"/>
         </w:numPr>
         <w:spacing w:after="60"/>
       </w:pPr>
@@ -53259,7 +54276,7 @@
         <w:pStyle w:val="ListParagraph"/>
         <w:numPr>
           <w:ilvl w:val="0"/>
-          <w:numId w:val="13"/>
+          <w:numId w:val="14"/>
         </w:numPr>
         <w:spacing w:after="60"/>
       </w:pPr>
@@ -53284,7 +54301,7 @@
         <w:pStyle w:val="ListParagraph"/>
         <w:numPr>
           <w:ilvl w:val="0"/>
-          <w:numId w:val="13"/>
+          <w:numId w:val="14"/>
         </w:numPr>
         <w:spacing w:after="60"/>
       </w:pPr>
@@ -53309,7 +54326,7 @@
         <w:pStyle w:val="ListParagraph"/>
         <w:numPr>
           <w:ilvl w:val="0"/>
-          <w:numId w:val="13"/>
+          <w:numId w:val="14"/>
         </w:numPr>
         <w:spacing w:after="60"/>
       </w:pPr>
@@ -53358,7 +54375,7 @@
         <w:pStyle w:val="ListParagraph"/>
         <w:numPr>
           <w:ilvl w:val="0"/>
-          <w:numId w:val="13"/>
+          <w:numId w:val="14"/>
         </w:numPr>
         <w:spacing w:after="60"/>
       </w:pPr>
@@ -54180,7 +55197,7 @@
           <w:sz w:val="18"/>
           <w:szCs w:val="18"/>
         </w:rPr>
-        <w:t xml:space="preserve">Table 29: Demo accounts</w:t>
+        <w:t xml:space="preserve">Table 30: Demo accounts</w:t>
       </w:r>
     </w:p>
     <w:p>
@@ -55127,6 +56144,72 @@
                 <w:sz w:val="19"/>
                 <w:szCs w:val="19"/>
               </w:rPr>
+              <w:t xml:space="preserve">Swagger / OpenAPI</w:t>
+            </w:r>
+          </w:p>
+        </w:tc>
+        <w:tc>
+          <w:tcPr>
+            <w:tcW w:type="dxa" w:w="6626"/>
+            <w:tcBorders>
+              <w:top w:val="single" w:color="A6A6A6" w:sz="4"/>
+              <w:left w:val="single" w:color="A6A6A6" w:sz="4"/>
+              <w:bottom w:val="single" w:color="A6A6A6" w:sz="4"/>
+              <w:right w:val="single" w:color="A6A6A6" w:sz="4"/>
+            </w:tcBorders>
+            <w:tcMar>
+              <w:top w:type="dxa" w:w="60"/>
+              <w:left w:type="dxa" w:w="100"/>
+              <w:bottom w:type="dxa" w:w="60"/>
+              <w:right w:type="dxa" w:w="100"/>
+            </w:tcMar>
+            <w:vAlign w:val="center"/>
+          </w:tcPr>
+          <w:p>
+            <w:pPr>
+              <w:spacing w:after="0"/>
+            </w:pPr>
+            <w:r>
+              <w:rPr>
+                <w:b w:val="false"/>
+                <w:bCs w:val="false"/>
+                <w:sz w:val="19"/>
+                <w:szCs w:val="19"/>
+              </w:rPr>
+              <w:t xml:space="preserve">OpenAPI = a standard way to describe an API in one file; Swagger UI = the web page that shows it and lets you test it</w:t>
+            </w:r>
+          </w:p>
+        </w:tc>
+      </w:tr>
+      <w:tr>
+        <w:tc>
+          <w:tcPr>
+            <w:tcW w:type="dxa" w:w="2400"/>
+            <w:tcBorders>
+              <w:top w:val="single" w:color="A6A6A6" w:sz="4"/>
+              <w:left w:val="single" w:color="A6A6A6" w:sz="4"/>
+              <w:bottom w:val="single" w:color="A6A6A6" w:sz="4"/>
+              <w:right w:val="single" w:color="A6A6A6" w:sz="4"/>
+            </w:tcBorders>
+            <w:tcMar>
+              <w:top w:type="dxa" w:w="60"/>
+              <w:left w:type="dxa" w:w="100"/>
+              <w:bottom w:type="dxa" w:w="60"/>
+              <w:right w:type="dxa" w:w="100"/>
+            </w:tcMar>
+            <w:vAlign w:val="center"/>
+          </w:tcPr>
+          <w:p>
+            <w:pPr>
+              <w:spacing w:after="0"/>
+            </w:pPr>
+            <w:r>
+              <w:rPr>
+                <w:b w:val="false"/>
+                <w:bCs w:val="false"/>
+                <w:sz w:val="19"/>
+                <w:szCs w:val="19"/>
+              </w:rPr>
               <w:t xml:space="preserve">Schema</w:t>
             </w:r>
           </w:p>
@@ -56102,7 +57185,7 @@
           <w:sz w:val="18"/>
           <w:szCs w:val="18"/>
         </w:rPr>
-        <w:t xml:space="preserve">Table 30: Glossary</w:t>
+        <w:t xml:space="preserve">Table 31: Glossary</w:t>
       </w:r>
     </w:p>
     <w:sectPr>
@@ -56527,6 +57610,12 @@
       <w:startOverride w:val="1"/>
     </w:lvlOverride>
   </w:num>
+  <w:num w:numId="14">
+    <w:abstractNumId w:val="3"/>
+    <w:lvlOverride w:ilvl="0">
+      <w:startOverride w:val="1"/>
+    </w:lvlOverride>
+  </w:num>
 </w:numbering>
 </file>
 

</xml_diff>